<commit_message>
Tab.5 Byte-Index korrigiert zu (6 … n+5)
</commit_message>
<xml_diff>
--- a/00 doc/00 Bussystem/USV_Slave_Anwender_Schnittstelle.docx
+++ b/00 doc/00 Bussystem/USV_Slave_Anwender_Schnittstelle.docx
@@ -1,6 +1,6 @@
 
 <file path=word/document.xml><?xml version="1.0" encoding="utf-8"?>
-<w:document xmlns:wpc="http://schemas.microsoft.com/office/word/2010/wordprocessingCanvas" xmlns:cx="http://schemas.microsoft.com/office/drawing/2014/chartex" xmlns:cx1="http://schemas.microsoft.com/office/drawing/2015/9/8/chartex" xmlns:cx2="http://schemas.microsoft.com/office/drawing/2015/10/21/chartex" xmlns:cx3="http://schemas.microsoft.com/office/drawing/2016/5/9/chartex" xmlns:cx4="http://schemas.microsoft.com/office/drawing/2016/5/10/chartex" xmlns:cx5="http://schemas.microsoft.com/office/drawing/2016/5/11/chartex" xmlns:cx6="http://schemas.microsoft.com/office/drawing/2016/5/12/chartex" xmlns:cx7="http://schemas.microsoft.com/office/drawing/2016/5/13/chartex" xmlns:cx8="http://schemas.microsoft.com/office/drawing/2016/5/14/chartex" xmlns:mc="http://schemas.openxmlformats.org/markup-compatibility/2006" xmlns:aink="http://schemas.microsoft.com/office/drawing/2016/ink" xmlns:am3d="http://schemas.microsoft.com/office/drawing/2017/model3d" xmlns:o="urn:schemas-microsoft-com:office:office" xmlns:oel="http://schemas.microsoft.com/office/2019/extlst" xmlns:r="http://schemas.openxmlformats.org/officeDocument/2006/relationships" xmlns:m="http://schemas.openxmlformats.org/officeDocument/2006/math" xmlns:v="urn:schemas-microsoft-com:vml" xmlns:wp14="http://schemas.microsoft.com/office/word/2010/wordprocessingDrawing" xmlns:wp="http://schemas.openxmlformats.org/drawingml/2006/wordprocessingDrawing" xmlns:w10="urn:schemas-microsoft-com:office:word" xmlns:w="http://schemas.openxmlformats.org/wordprocessingml/2006/main" xmlns:w14="http://schemas.microsoft.com/office/word/2010/wordml" xmlns:w15="http://schemas.microsoft.com/office/word/2012/wordml" xmlns:w16cex="http://schemas.microsoft.com/office/word/2018/wordml/cex" xmlns:w16cid="http://schemas.microsoft.com/office/word/2016/wordml/cid" xmlns:w16="http://schemas.microsoft.com/office/word/2018/wordml" xmlns:w16sdtdh="http://schemas.microsoft.com/office/word/2020/wordml/sdtdatahash" xmlns:w16se="http://schemas.microsoft.com/office/word/2015/wordml/symex" xmlns:wpg="http://schemas.microsoft.com/office/word/2010/wordprocessingGroup" xmlns:wpi="http://schemas.microsoft.com/office/word/2010/wordprocessingInk" xmlns:wne="http://schemas.microsoft.com/office/word/2006/wordml" xmlns:wps="http://schemas.microsoft.com/office/word/2010/wordprocessingShape" mc:Ignorable="w14 w15 w16se w16cid w16 w16cex w16sdtdh wp14">
+<w:document xmlns:wpc="http://schemas.microsoft.com/office/word/2010/wordprocessingCanvas" xmlns:mc="http://schemas.openxmlformats.org/markup-compatibility/2006" xmlns:o="urn:schemas-microsoft-com:office:office" xmlns:r="http://schemas.openxmlformats.org/officeDocument/2006/relationships" xmlns:m="http://schemas.openxmlformats.org/officeDocument/2006/math" xmlns:v="urn:schemas-microsoft-com:vml" xmlns:wp14="http://schemas.microsoft.com/office/word/2010/wordprocessingDrawing" xmlns:wp="http://schemas.openxmlformats.org/drawingml/2006/wordprocessingDrawing" xmlns:w10="urn:schemas-microsoft-com:office:word" xmlns:w="http://schemas.openxmlformats.org/wordprocessingml/2006/main" xmlns:w14="http://schemas.microsoft.com/office/word/2010/wordml" xmlns:w15="http://schemas.microsoft.com/office/word/2012/wordml" xmlns:wpg="http://schemas.microsoft.com/office/word/2010/wordprocessingGroup" xmlns:wpi="http://schemas.microsoft.com/office/word/2010/wordprocessingInk" xmlns:wne="http://schemas.microsoft.com/office/word/2006/wordml" xmlns:wps="http://schemas.microsoft.com/office/word/2010/wordprocessingShape" mc:Ignorable="w14 w15 wp14">
   <w:body>
     <w:p>
       <w:pPr>
@@ -108,8 +108,17 @@
                 <w:rFonts w:cs="Arial"/>
                 <w:szCs w:val="22"/>
               </w:rPr>
-              <w:t xml:space="preserve"> Surface Vehicle</w:t>
-            </w:r>
+              <w:t xml:space="preserve"> Surface </w:t>
+            </w:r>
+            <w:proofErr w:type="spellStart"/>
+            <w:r>
+              <w:rPr>
+                <w:rFonts w:cs="Arial"/>
+                <w:szCs w:val="22"/>
+              </w:rPr>
+              <w:t>Vehicle</w:t>
+            </w:r>
+            <w:proofErr w:type="spellEnd"/>
           </w:p>
         </w:tc>
       </w:tr>
@@ -379,7 +388,7 @@
                 <w:noProof/>
                 <w:szCs w:val="22"/>
               </w:rPr>
-              <w:t>07.06.2023</w:t>
+              <w:t>13.07.2023</w:t>
             </w:r>
             <w:r>
               <w:rPr>
@@ -2147,6 +2156,198 @@
           </w:p>
         </w:tc>
       </w:tr>
+      <w:tr>
+        <w:tc>
+          <w:tcPr>
+            <w:tcW w:w="494" w:type="dxa"/>
+          </w:tcPr>
+          <w:p>
+            <w:pPr>
+              <w:rPr>
+                <w:rFonts w:cs="Arial"/>
+                <w:sz w:val="20"/>
+                <w:szCs w:val="20"/>
+              </w:rPr>
+            </w:pPr>
+            <w:r>
+              <w:rPr>
+                <w:rFonts w:cs="Arial"/>
+                <w:sz w:val="20"/>
+                <w:szCs w:val="20"/>
+              </w:rPr>
+              <w:t>7</w:t>
+            </w:r>
+          </w:p>
+        </w:tc>
+        <w:tc>
+          <w:tcPr>
+            <w:tcW w:w="1076" w:type="dxa"/>
+          </w:tcPr>
+          <w:p>
+            <w:pPr>
+              <w:rPr>
+                <w:rFonts w:cs="Arial"/>
+                <w:sz w:val="20"/>
+                <w:szCs w:val="20"/>
+              </w:rPr>
+            </w:pPr>
+            <w:r>
+              <w:rPr>
+                <w:rFonts w:cs="Arial"/>
+                <w:sz w:val="20"/>
+                <w:szCs w:val="20"/>
+              </w:rPr>
+              <w:t>13.07.2023</w:t>
+            </w:r>
+          </w:p>
+        </w:tc>
+        <w:tc>
+          <w:tcPr>
+            <w:tcW w:w="1037" w:type="dxa"/>
+          </w:tcPr>
+          <w:p>
+            <w:pPr>
+              <w:rPr>
+                <w:rFonts w:cs="Arial"/>
+                <w:sz w:val="20"/>
+                <w:szCs w:val="20"/>
+              </w:rPr>
+            </w:pPr>
+            <w:r>
+              <w:rPr>
+                <w:rFonts w:cs="Arial"/>
+                <w:sz w:val="20"/>
+                <w:szCs w:val="20"/>
+              </w:rPr>
+              <w:t>1.06</w:t>
+            </w:r>
+          </w:p>
+        </w:tc>
+        <w:tc>
+          <w:tcPr>
+            <w:tcW w:w="1637" w:type="dxa"/>
+          </w:tcPr>
+          <w:p>
+            <w:pPr>
+              <w:rPr>
+                <w:rFonts w:cs="Arial"/>
+                <w:sz w:val="20"/>
+                <w:szCs w:val="20"/>
+              </w:rPr>
+            </w:pPr>
+            <w:r>
+              <w:rPr>
+                <w:rFonts w:cs="Arial"/>
+                <w:sz w:val="20"/>
+                <w:szCs w:val="20"/>
+              </w:rPr>
+              <w:t>Protokoll</w:t>
+            </w:r>
+          </w:p>
+        </w:tc>
+        <w:tc>
+          <w:tcPr>
+            <w:tcW w:w="3371" w:type="dxa"/>
+          </w:tcPr>
+          <w:p>
+            <w:pPr>
+              <w:rPr>
+                <w:rFonts w:cs="Arial"/>
+                <w:sz w:val="20"/>
+                <w:szCs w:val="20"/>
+              </w:rPr>
+            </w:pPr>
+            <w:r>
+              <w:rPr>
+                <w:rFonts w:cs="Arial"/>
+                <w:sz w:val="20"/>
+                <w:szCs w:val="20"/>
+              </w:rPr>
+              <w:t>Tab.5 Byte-Index korrigiert zu (</w:t>
+            </w:r>
+            <w:r>
+              <w:rPr>
+                <w:rFonts w:ascii="Myriad Pro" w:hAnsi="Myriad Pro"/>
+                <w:sz w:val="18"/>
+                <w:szCs w:val="18"/>
+              </w:rPr>
+              <w:t>6 … n+</w:t>
+            </w:r>
+            <w:r>
+              <w:rPr>
+                <w:rFonts w:ascii="Myriad Pro" w:hAnsi="Myriad Pro"/>
+                <w:b/>
+                <w:sz w:val="18"/>
+                <w:szCs w:val="18"/>
+              </w:rPr>
+              <w:t>5</w:t>
+            </w:r>
+            <w:r>
+              <w:rPr>
+                <w:rFonts w:ascii="Myriad Pro" w:hAnsi="Myriad Pro"/>
+                <w:b/>
+                <w:sz w:val="18"/>
+                <w:szCs w:val="18"/>
+              </w:rPr>
+              <w:t>)</w:t>
+            </w:r>
+          </w:p>
+        </w:tc>
+        <w:tc>
+          <w:tcPr>
+            <w:tcW w:w="796" w:type="dxa"/>
+          </w:tcPr>
+          <w:p>
+            <w:pPr>
+              <w:rPr>
+                <w:rFonts w:cs="Arial"/>
+                <w:sz w:val="20"/>
+                <w:szCs w:val="20"/>
+              </w:rPr>
+            </w:pPr>
+            <w:r>
+              <w:rPr>
+                <w:rFonts w:cs="Arial"/>
+                <w:sz w:val="20"/>
+                <w:szCs w:val="20"/>
+              </w:rPr>
+              <w:t>Fr</w:t>
+            </w:r>
+          </w:p>
+        </w:tc>
+        <w:tc>
+          <w:tcPr>
+            <w:tcW w:w="1195" w:type="dxa"/>
+          </w:tcPr>
+          <w:p>
+            <w:pPr>
+              <w:rPr>
+                <w:rFonts w:cs="Arial"/>
+                <w:sz w:val="20"/>
+                <w:szCs w:val="20"/>
+              </w:rPr>
+            </w:pPr>
+            <w:proofErr w:type="spellStart"/>
+            <w:r>
+              <w:rPr>
+                <w:rFonts w:cs="Arial"/>
+                <w:sz w:val="20"/>
+                <w:szCs w:val="20"/>
+              </w:rPr>
+              <w:t>f.g</w:t>
+            </w:r>
+            <w:proofErr w:type="spellEnd"/>
+            <w:r>
+              <w:rPr>
+                <w:rFonts w:cs="Arial"/>
+                <w:sz w:val="20"/>
+                <w:szCs w:val="20"/>
+              </w:rPr>
+              <w:t>.</w:t>
+            </w:r>
+          </w:p>
+        </w:tc>
+      </w:tr>
     </w:tbl>
     <w:p>
       <w:pPr>
@@ -2287,6 +2488,8 @@
         </w:rPr>
         <w:t>.)</w:t>
       </w:r>
+      <w:bookmarkStart w:id="0" w:name="_GoBack"/>
+      <w:bookmarkEnd w:id="0"/>
     </w:p>
     <w:p>
       <w:pPr>
@@ -2348,12 +2551,49 @@
         </w:rPr>
         <w:t xml:space="preserve">Bus zu schreiben oder zu lesen, ist </w:t>
       </w:r>
+      <w:r>
+        <w:rPr>
+          <w:szCs w:val="22"/>
+        </w:rPr>
+        <w:t>am</w:t>
+      </w:r>
+      <w:r>
+        <w:rPr>
+          <w:szCs w:val="22"/>
+        </w:rPr>
+        <w:t xml:space="preserve"> </w:t>
+      </w:r>
       <w:proofErr w:type="gramStart"/>
       <w:r>
         <w:rPr>
           <w:szCs w:val="22"/>
         </w:rPr>
-        <w:t>am</w:t>
+        <w:t>USV-Slave</w:t>
+      </w:r>
+      <w:proofErr w:type="gramEnd"/>
+      <w:r>
+        <w:rPr>
+          <w:szCs w:val="22"/>
+        </w:rPr>
+        <w:t xml:space="preserve"> eine </w:t>
+      </w:r>
+      <w:r>
+        <w:rPr>
+          <w:szCs w:val="22"/>
+        </w:rPr>
+        <w:t>p</w:t>
+      </w:r>
+      <w:r>
+        <w:rPr>
+          <w:szCs w:val="22"/>
+        </w:rPr>
+        <w:t xml:space="preserve">hysische Datenschnittstelle und ein </w:t>
+      </w:r>
+      <w:r>
+        <w:rPr>
+          <w:szCs w:val="22"/>
+        </w:rPr>
+        <w:t>Übertragungsprotokoll</w:t>
       </w:r>
       <w:r>
         <w:rPr>
@@ -2365,26 +2605,97 @@
         <w:rPr>
           <w:szCs w:val="22"/>
         </w:rPr>
-        <w:t>USV-Slave</w:t>
-      </w:r>
-      <w:proofErr w:type="gramEnd"/>
-      <w:r>
-        <w:rPr>
-          <w:szCs w:val="22"/>
-        </w:rPr>
-        <w:t xml:space="preserve"> eine </w:t>
-      </w:r>
-      <w:r>
-        <w:rPr>
-          <w:szCs w:val="22"/>
-        </w:rPr>
-        <w:t>p</w:t>
-      </w:r>
-      <w:r>
-        <w:rPr>
-          <w:szCs w:val="22"/>
-        </w:rPr>
-        <w:t xml:space="preserve">hysische Datenschnittstelle und ein </w:t>
+        <w:t>notwendig</w:t>
+      </w:r>
+      <w:r>
+        <w:rPr>
+          <w:szCs w:val="22"/>
+        </w:rPr>
+        <w:t xml:space="preserve">. Da </w:t>
+      </w:r>
+      <w:r>
+        <w:rPr>
+          <w:szCs w:val="22"/>
+        </w:rPr>
+        <w:t>eine</w:t>
+      </w:r>
+      <w:r>
+        <w:rPr>
+          <w:szCs w:val="22"/>
+        </w:rPr>
+        <w:t xml:space="preserve"> UART</w:t>
+      </w:r>
+      <w:r>
+        <w:rPr>
+          <w:szCs w:val="22"/>
+        </w:rPr>
+        <w:t>-</w:t>
+      </w:r>
+      <w:r>
+        <w:rPr>
+          <w:szCs w:val="22"/>
+        </w:rPr>
+        <w:t xml:space="preserve">Schnittstelle auf den meisten Mikrocontrollern zu finden ist, wurde diese </w:t>
+      </w:r>
+      <w:r>
+        <w:rPr>
+          <w:szCs w:val="22"/>
+        </w:rPr>
+        <w:t xml:space="preserve">Schnittstelle </w:t>
+      </w:r>
+      <w:r>
+        <w:rPr>
+          <w:szCs w:val="22"/>
+        </w:rPr>
+        <w:t xml:space="preserve">für die Datenübertragung ausgewählt. Zur </w:t>
+      </w:r>
+      <w:r>
+        <w:rPr>
+          <w:szCs w:val="22"/>
+        </w:rPr>
+        <w:t>sicheren Datenübertragung</w:t>
+      </w:r>
+      <w:r>
+        <w:rPr>
+          <w:szCs w:val="22"/>
+        </w:rPr>
+        <w:t xml:space="preserve"> wird auf d</w:t>
+      </w:r>
+      <w:r>
+        <w:rPr>
+          <w:szCs w:val="22"/>
+        </w:rPr>
+        <w:t>er</w:t>
+      </w:r>
+      <w:r>
+        <w:rPr>
+          <w:szCs w:val="22"/>
+        </w:rPr>
+        <w:t xml:space="preserve"> UART</w:t>
+      </w:r>
+      <w:r>
+        <w:rPr>
+          <w:szCs w:val="22"/>
+        </w:rPr>
+        <w:t>-</w:t>
+      </w:r>
+      <w:r>
+        <w:rPr>
+          <w:szCs w:val="22"/>
+        </w:rPr>
+        <w:t xml:space="preserve">Schnittstelle ein </w:t>
+      </w:r>
+      <w:r>
+        <w:rPr>
+          <w:szCs w:val="22"/>
+        </w:rPr>
+        <w:t>f</w:t>
+      </w:r>
+      <w:r>
+        <w:rPr>
+          <w:szCs w:val="22"/>
+        </w:rPr>
+        <w:t xml:space="preserve">ramebasierendes </w:t>
       </w:r>
       <w:r>
         <w:rPr>
@@ -2396,31 +2707,31 @@
         <w:rPr>
           <w:szCs w:val="22"/>
         </w:rPr>
+        <w:t xml:space="preserve"> realisiert.</w:t>
+      </w:r>
+      <w:r>
+        <w:rPr>
+          <w:szCs w:val="22"/>
+        </w:rPr>
         <w:t xml:space="preserve"> </w:t>
       </w:r>
       <w:r>
         <w:rPr>
           <w:szCs w:val="22"/>
         </w:rPr>
-        <w:t>notwendig</w:t>
-      </w:r>
-      <w:r>
-        <w:rPr>
-          <w:szCs w:val="22"/>
-        </w:rPr>
-        <w:t xml:space="preserve">. Da </w:t>
-      </w:r>
-      <w:r>
-        <w:rPr>
-          <w:szCs w:val="22"/>
-        </w:rPr>
-        <w:t>eine</w:t>
-      </w:r>
-      <w:r>
-        <w:rPr>
-          <w:szCs w:val="22"/>
-        </w:rPr>
-        <w:t xml:space="preserve"> UART</w:t>
+        <w:t xml:space="preserve">Dieses </w:t>
+      </w:r>
+      <w:r>
+        <w:rPr>
+          <w:szCs w:val="22"/>
+        </w:rPr>
+        <w:t xml:space="preserve">Dokument </w:t>
+      </w:r>
+      <w:r>
+        <w:rPr>
+          <w:szCs w:val="22"/>
+        </w:rPr>
+        <w:t>beschreibt die UART</w:t>
       </w:r>
       <w:r>
         <w:rPr>
@@ -2432,114 +2743,6 @@
         <w:rPr>
           <w:szCs w:val="22"/>
         </w:rPr>
-        <w:t xml:space="preserve">Schnittstelle auf den meisten Mikrocontrollern zu finden ist, wurde diese </w:t>
-      </w:r>
-      <w:r>
-        <w:rPr>
-          <w:szCs w:val="22"/>
-        </w:rPr>
-        <w:t xml:space="preserve">Schnittstelle </w:t>
-      </w:r>
-      <w:r>
-        <w:rPr>
-          <w:szCs w:val="22"/>
-        </w:rPr>
-        <w:t xml:space="preserve">für die Datenübertragung ausgewählt. Zur </w:t>
-      </w:r>
-      <w:r>
-        <w:rPr>
-          <w:szCs w:val="22"/>
-        </w:rPr>
-        <w:t>sicheren Datenübertragung</w:t>
-      </w:r>
-      <w:r>
-        <w:rPr>
-          <w:szCs w:val="22"/>
-        </w:rPr>
-        <w:t xml:space="preserve"> wird auf d</w:t>
-      </w:r>
-      <w:r>
-        <w:rPr>
-          <w:szCs w:val="22"/>
-        </w:rPr>
-        <w:t>er</w:t>
-      </w:r>
-      <w:r>
-        <w:rPr>
-          <w:szCs w:val="22"/>
-        </w:rPr>
-        <w:t xml:space="preserve"> UART</w:t>
-      </w:r>
-      <w:r>
-        <w:rPr>
-          <w:szCs w:val="22"/>
-        </w:rPr>
-        <w:t>-</w:t>
-      </w:r>
-      <w:r>
-        <w:rPr>
-          <w:szCs w:val="22"/>
-        </w:rPr>
-        <w:t xml:space="preserve">Schnittstelle ein </w:t>
-      </w:r>
-      <w:r>
-        <w:rPr>
-          <w:szCs w:val="22"/>
-        </w:rPr>
-        <w:t>f</w:t>
-      </w:r>
-      <w:r>
-        <w:rPr>
-          <w:szCs w:val="22"/>
-        </w:rPr>
-        <w:t xml:space="preserve">ramebasierendes </w:t>
-      </w:r>
-      <w:r>
-        <w:rPr>
-          <w:szCs w:val="22"/>
-        </w:rPr>
-        <w:t>Übertragungsprotokoll</w:t>
-      </w:r>
-      <w:r>
-        <w:rPr>
-          <w:szCs w:val="22"/>
-        </w:rPr>
-        <w:t xml:space="preserve"> realisiert.</w:t>
-      </w:r>
-      <w:r>
-        <w:rPr>
-          <w:szCs w:val="22"/>
-        </w:rPr>
-        <w:t xml:space="preserve"> </w:t>
-      </w:r>
-      <w:r>
-        <w:rPr>
-          <w:szCs w:val="22"/>
-        </w:rPr>
-        <w:t xml:space="preserve">Dieses </w:t>
-      </w:r>
-      <w:r>
-        <w:rPr>
-          <w:szCs w:val="22"/>
-        </w:rPr>
-        <w:t xml:space="preserve">Dokument </w:t>
-      </w:r>
-      <w:r>
-        <w:rPr>
-          <w:szCs w:val="22"/>
-        </w:rPr>
-        <w:t>beschreibt die UART</w:t>
-      </w:r>
-      <w:r>
-        <w:rPr>
-          <w:szCs w:val="22"/>
-        </w:rPr>
-        <w:t>-</w:t>
-      </w:r>
-      <w:r>
-        <w:rPr>
-          <w:szCs w:val="22"/>
-        </w:rPr>
         <w:t xml:space="preserve">Schnittstelle und das </w:t>
       </w:r>
       <w:r>
@@ -2560,19 +2763,11 @@
         </w:rPr>
         <w:t xml:space="preserve">, um eine störungsfreie Kommunikation </w:t>
       </w:r>
-      <w:proofErr w:type="gramStart"/>
-      <w:r>
-        <w:rPr>
-          <w:szCs w:val="22"/>
-        </w:rPr>
-        <w:t>zwischen dem USV-Slave</w:t>
-      </w:r>
-      <w:proofErr w:type="gramEnd"/>
-      <w:r>
-        <w:rPr>
-          <w:szCs w:val="22"/>
-        </w:rPr>
-        <w:t xml:space="preserve"> und der </w:t>
+      <w:r>
+        <w:rPr>
+          <w:szCs w:val="22"/>
+        </w:rPr>
+        <w:t xml:space="preserve">zwischen dem USV-Slave und der </w:t>
       </w:r>
       <w:r>
         <w:rPr>
@@ -4433,8 +4628,8 @@
           <w:szCs w:val="22"/>
         </w:rPr>
       </w:pPr>
-      <w:bookmarkStart w:id="0" w:name="_Ref56792966"/>
-      <w:bookmarkStart w:id="1" w:name="_Ref56792903"/>
+      <w:bookmarkStart w:id="1" w:name="_Ref56792966"/>
+      <w:bookmarkStart w:id="2" w:name="_Ref56792903"/>
       <w:r>
         <w:rPr>
           <w:color w:val="auto"/>
@@ -4479,7 +4674,7 @@
         </w:rPr>
         <w:fldChar w:fldCharType="end"/>
       </w:r>
-      <w:bookmarkEnd w:id="0"/>
+      <w:bookmarkEnd w:id="1"/>
       <w:r>
         <w:rPr>
           <w:noProof/>
@@ -4532,7 +4727,7 @@
         </w:rPr>
         <w:t>UART-Frame</w:t>
       </w:r>
-      <w:bookmarkEnd w:id="1"/>
+      <w:bookmarkEnd w:id="2"/>
     </w:p>
     <w:p>
       <w:pPr>
@@ -4767,11 +4962,11 @@
         <w:t>-</w:t>
       </w:r>
       <w:r>
-        <w:t xml:space="preserve">Konfiguration wird </w:t>
+        <w:t xml:space="preserve">Konfiguration wird vom </w:t>
       </w:r>
       <w:proofErr w:type="gramStart"/>
       <w:r>
-        <w:t>vom USV-Slave</w:t>
+        <w:t>USV-Slave</w:t>
       </w:r>
       <w:proofErr w:type="gramEnd"/>
       <w:r>
@@ -5396,62 +5591,62 @@
         <w:t>Das Übertragungsprotokoll beschreibt den Übertragungsablauf</w:t>
       </w:r>
       <w:r>
+        <w:t xml:space="preserve"> zum </w:t>
+      </w:r>
+      <w:proofErr w:type="gramStart"/>
+      <w:r>
+        <w:t>USV-Slave</w:t>
+      </w:r>
+      <w:proofErr w:type="gramEnd"/>
+      <w:r>
+        <w:t xml:space="preserve">, um Daten </w:t>
+      </w:r>
+      <w:r>
+        <w:t xml:space="preserve">auf </w:t>
+      </w:r>
+      <w:r>
+        <w:t xml:space="preserve">den RS485-Bus zu schreiben oder Daten </w:t>
+      </w:r>
+      <w:r>
+        <w:t>vom</w:t>
+      </w:r>
+      <w:r>
+        <w:t xml:space="preserve"> RS485-Bus zu lesen. Die Daten, die </w:t>
+      </w:r>
+      <w:r>
+        <w:t xml:space="preserve">auf </w:t>
+      </w:r>
+      <w:r>
+        <w:t>den RS485-Bus ge</w:t>
+      </w:r>
+      <w:r>
+        <w:t>schrieben werden dürfen sind a</w:t>
+      </w:r>
+      <w:r>
+        <w:t xml:space="preserve">bhängig von </w:t>
+      </w:r>
+      <w:r>
+        <w:t>Typ</w:t>
+      </w:r>
+      <w:r>
+        <w:t xml:space="preserve"> der</w:t>
+      </w:r>
+      <w:r>
+        <w:t xml:space="preserve"> an de</w:t>
+      </w:r>
+      <w:r>
+        <w:t>m</w:t>
+      </w:r>
+      <w:r>
         <w:t xml:space="preserve"> </w:t>
       </w:r>
       <w:proofErr w:type="gramStart"/>
       <w:r>
-        <w:t>zum USV-Slave</w:t>
+        <w:t>USV-Slave</w:t>
       </w:r>
       <w:proofErr w:type="gramEnd"/>
       <w:r>
-        <w:t xml:space="preserve">, um Daten </w:t>
-      </w:r>
-      <w:r>
-        <w:t xml:space="preserve">auf </w:t>
-      </w:r>
-      <w:r>
-        <w:t xml:space="preserve">den RS485-Bus zu schreiben oder Daten </w:t>
-      </w:r>
-      <w:r>
-        <w:t>vom</w:t>
-      </w:r>
-      <w:r>
-        <w:t xml:space="preserve"> RS485-Bus zu lesen. Die Daten, die </w:t>
-      </w:r>
-      <w:r>
-        <w:t xml:space="preserve">auf </w:t>
-      </w:r>
-      <w:r>
-        <w:t>den RS485-Bus ge</w:t>
-      </w:r>
-      <w:r>
-        <w:t xml:space="preserve">schrieben werden </w:t>
-      </w:r>
-      <w:proofErr w:type="gramStart"/>
-      <w:r>
-        <w:t>dürfen</w:t>
-      </w:r>
-      <w:proofErr w:type="gramEnd"/>
-      <w:r>
-        <w:t xml:space="preserve"> sind a</w:t>
-      </w:r>
-      <w:r>
-        <w:t xml:space="preserve">bhängig von </w:t>
-      </w:r>
-      <w:r>
-        <w:t>Typ</w:t>
-      </w:r>
-      <w:r>
-        <w:t xml:space="preserve"> der</w:t>
-      </w:r>
-      <w:r>
-        <w:t xml:space="preserve"> an de</w:t>
-      </w:r>
-      <w:r>
-        <w:t>m</w:t>
-      </w:r>
-      <w:r>
-        <w:t xml:space="preserve"> USV-Slave angeschlossenen </w:t>
+        <w:t xml:space="preserve"> angeschlossenen </w:t>
       </w:r>
       <w:r>
         <w:t>User-Unit</w:t>
@@ -6697,15 +6892,7 @@
         <w:jc w:val="both"/>
       </w:pPr>
       <w:r>
-        <w:t xml:space="preserve">Um Daten </w:t>
-      </w:r>
-      <w:proofErr w:type="gramStart"/>
-      <w:r>
-        <w:t>an den USV-Slave</w:t>
-      </w:r>
-      <w:proofErr w:type="gramEnd"/>
-      <w:r>
-        <w:t xml:space="preserve"> zu </w:t>
+        <w:t xml:space="preserve">Um Daten an den USV-Slave zu </w:t>
       </w:r>
       <w:r>
         <w:t>schreiben</w:t>
@@ -8095,18 +8282,8 @@
                 <w:sz w:val="18"/>
                 <w:szCs w:val="18"/>
               </w:rPr>
-              <w:t xml:space="preserve">Antwort </w:t>
-            </w:r>
-            <w:proofErr w:type="gramStart"/>
-            <w:r>
-              <w:rPr>
-                <w:rFonts w:ascii="Myriad Pro" w:hAnsi="Myriad Pro"/>
-                <w:sz w:val="18"/>
-                <w:szCs w:val="18"/>
-              </w:rPr>
-              <w:t>vom USV-Slave</w:t>
-            </w:r>
-            <w:proofErr w:type="gramEnd"/>
+              <w:t>Antwort vom USV-Slave</w:t>
+            </w:r>
           </w:p>
           <w:p>
             <w:pPr>
@@ -8204,7 +8381,7 @@
           <w:color w:val="auto"/>
         </w:rPr>
       </w:pPr>
-      <w:bookmarkStart w:id="2" w:name="_Ref56793254"/>
+      <w:bookmarkStart w:id="3" w:name="_Ref56793254"/>
       <w:r>
         <w:rPr>
           <w:color w:val="auto"/>
@@ -8217,7 +8394,7 @@
         </w:rPr>
         <w:t>. 4:</w:t>
       </w:r>
-      <w:bookmarkEnd w:id="2"/>
+      <w:bookmarkEnd w:id="3"/>
       <w:r>
         <w:rPr>
           <w:b w:val="0"/>
@@ -8240,11 +8417,11 @@
         <w:jc w:val="both"/>
       </w:pPr>
       <w:r>
-        <w:t xml:space="preserve">Um Daten </w:t>
+        <w:t xml:space="preserve">Um Daten vom </w:t>
       </w:r>
       <w:proofErr w:type="gramStart"/>
       <w:r>
-        <w:t>vom USV-Slave</w:t>
+        <w:t>USV-Slave</w:t>
       </w:r>
       <w:proofErr w:type="gramEnd"/>
       <w:r>
@@ -10521,7 +10698,16 @@
                 <w:sz w:val="18"/>
                 <w:szCs w:val="18"/>
               </w:rPr>
-              <w:t>6 … n+6</w:t>
+              <w:t>6 … n+</w:t>
+            </w:r>
+            <w:r>
+              <w:rPr>
+                <w:rFonts w:ascii="Myriad Pro" w:hAnsi="Myriad Pro"/>
+                <w:b w:val="0"/>
+                <w:sz w:val="18"/>
+                <w:szCs w:val="18"/>
+              </w:rPr>
+              <w:t>5</w:t>
             </w:r>
           </w:p>
         </w:tc>
@@ -10705,7 +10891,7 @@
                 <w:sz w:val="18"/>
                 <w:szCs w:val="18"/>
               </w:rPr>
-              <w:t>n+7</w:t>
+              <w:t>n+6</w:t>
             </w:r>
           </w:p>
         </w:tc>
@@ -10864,7 +11050,7 @@
                 <w:sz w:val="18"/>
                 <w:szCs w:val="18"/>
               </w:rPr>
-              <w:t>n+8</w:t>
+              <w:t>n+7</w:t>
             </w:r>
           </w:p>
         </w:tc>
@@ -11004,7 +11190,7 @@
           <w:color w:val="auto"/>
         </w:rPr>
       </w:pPr>
-      <w:bookmarkStart w:id="3" w:name="_Ref56793269"/>
+      <w:bookmarkStart w:id="4" w:name="_Ref56793269"/>
       <w:r>
         <w:rPr>
           <w:color w:val="auto"/>
@@ -11017,7 +11203,7 @@
         </w:rPr>
         <w:t>. 5:</w:t>
       </w:r>
-      <w:bookmarkEnd w:id="3"/>
+      <w:bookmarkEnd w:id="4"/>
       <w:r>
         <w:rPr>
           <w:b w:val="0"/>
@@ -12784,17 +12970,7 @@
                 <w:sz w:val="18"/>
                 <w:szCs w:val="18"/>
               </w:rPr>
-              <w:t xml:space="preserve">teilt </w:t>
-            </w:r>
-            <w:proofErr w:type="gramStart"/>
-            <w:r>
-              <w:rPr>
-                <w:rFonts w:ascii="Myriad Pro" w:hAnsi="Myriad Pro"/>
-                <w:color w:val="auto"/>
-                <w:sz w:val="18"/>
-                <w:szCs w:val="18"/>
-              </w:rPr>
-              <w:t>de</w:t>
+              <w:t>teilt de</w:t>
             </w:r>
             <w:r>
               <w:rPr>
@@ -12812,17 +12988,7 @@
                 <w:sz w:val="18"/>
                 <w:szCs w:val="18"/>
               </w:rPr>
-              <w:t xml:space="preserve"> Slave</w:t>
-            </w:r>
-            <w:proofErr w:type="gramEnd"/>
-            <w:r>
-              <w:rPr>
-                <w:rFonts w:ascii="Myriad Pro" w:hAnsi="Myriad Pro"/>
-                <w:color w:val="auto"/>
-                <w:sz w:val="18"/>
-                <w:szCs w:val="18"/>
-              </w:rPr>
-              <w:t xml:space="preserve"> mit, welcher Logikpegel </w:t>
+              <w:t xml:space="preserve"> Slave mit, welcher Logikpegel </w:t>
             </w:r>
             <w:r>
               <w:rPr>
@@ -12978,23 +13144,13 @@
               </w:rPr>
               <w:t xml:space="preserve">Daten </w:t>
             </w:r>
-            <w:proofErr w:type="gramStart"/>
-            <w:r>
-              <w:rPr>
-                <w:rFonts w:ascii="Myriad Pro" w:hAnsi="Myriad Pro"/>
-                <w:sz w:val="18"/>
-                <w:szCs w:val="18"/>
-              </w:rPr>
-              <w:t>vom Slave</w:t>
-            </w:r>
-            <w:proofErr w:type="gramEnd"/>
-            <w:r>
-              <w:rPr>
-                <w:rFonts w:ascii="Myriad Pro" w:hAnsi="Myriad Pro"/>
-                <w:sz w:val="18"/>
-                <w:szCs w:val="18"/>
-              </w:rPr>
-              <w:t xml:space="preserve"> an </w:t>
+            <w:r>
+              <w:rPr>
+                <w:rFonts w:ascii="Myriad Pro" w:hAnsi="Myriad Pro"/>
+                <w:sz w:val="18"/>
+                <w:szCs w:val="18"/>
+              </w:rPr>
+              <w:t xml:space="preserve">vom Slave an </w:t>
             </w:r>
             <w:r>
               <w:rPr>
@@ -13149,19 +13305,8 @@
                 <w:sz w:val="18"/>
                 <w:szCs w:val="18"/>
               </w:rPr>
-              <w:t xml:space="preserve"> </w:t>
-            </w:r>
-            <w:proofErr w:type="gramStart"/>
-            <w:r>
-              <w:rPr>
-                <w:rFonts w:ascii="Myriad Pro" w:hAnsi="Myriad Pro"/>
-                <w:color w:val="auto"/>
-                <w:sz w:val="18"/>
-                <w:szCs w:val="18"/>
-              </w:rPr>
-              <w:t>an den Slave</w:t>
-            </w:r>
-            <w:proofErr w:type="gramEnd"/>
+              <w:t xml:space="preserve"> an den Slave</w:t>
+            </w:r>
           </w:p>
         </w:tc>
         <w:tc>
@@ -13312,7 +13457,6 @@
               <w:t xml:space="preserve">(Request </w:t>
             </w:r>
             <w:proofErr w:type="spellStart"/>
-            <w:proofErr w:type="gramStart"/>
             <w:r>
               <w:rPr>
                 <w:rFonts w:ascii="Myriad Pro" w:hAnsi="Myriad Pro"/>
@@ -13330,17 +13474,7 @@
                 <w:sz w:val="18"/>
                 <w:szCs w:val="18"/>
               </w:rPr>
-              <w:t xml:space="preserve"> send</w:t>
-            </w:r>
-            <w:proofErr w:type="gramEnd"/>
-            <w:r>
-              <w:rPr>
-                <w:rFonts w:ascii="Myriad Pro" w:hAnsi="Myriad Pro"/>
-                <w:color w:val="auto"/>
-                <w:sz w:val="18"/>
-                <w:szCs w:val="18"/>
-              </w:rPr>
-              <w:t xml:space="preserve"> = Aufforderung zum Senden)</w:t>
+              <w:t xml:space="preserve"> send = Aufforderung zum Senden)</w:t>
             </w:r>
           </w:p>
         </w:tc>
@@ -13492,7 +13626,6 @@
               <w:t xml:space="preserve"> (Clear </w:t>
             </w:r>
             <w:proofErr w:type="spellStart"/>
-            <w:proofErr w:type="gramStart"/>
             <w:r>
               <w:rPr>
                 <w:rFonts w:ascii="Myriad Pro" w:hAnsi="Myriad Pro"/>
@@ -13510,17 +13643,7 @@
                 <w:sz w:val="18"/>
                 <w:szCs w:val="18"/>
               </w:rPr>
-              <w:t xml:space="preserve"> send</w:t>
-            </w:r>
-            <w:proofErr w:type="gramEnd"/>
-            <w:r>
-              <w:rPr>
-                <w:rFonts w:ascii="Myriad Pro" w:hAnsi="Myriad Pro"/>
-                <w:color w:val="auto"/>
-                <w:sz w:val="18"/>
-                <w:szCs w:val="18"/>
-              </w:rPr>
-              <w:t xml:space="preserve"> = Erlaubnis zum Senden erteilt)</w:t>
+              <w:t xml:space="preserve"> send = Erlaubnis zum Senden erteilt)</w:t>
             </w:r>
           </w:p>
         </w:tc>
@@ -13648,18 +13771,8 @@
                 <w:sz w:val="18"/>
                 <w:szCs w:val="18"/>
               </w:rPr>
-              <w:t xml:space="preserve">Interrupt Meldung </w:t>
-            </w:r>
-            <w:proofErr w:type="gramStart"/>
-            <w:r>
-              <w:rPr>
-                <w:rFonts w:ascii="Myriad Pro" w:hAnsi="Myriad Pro"/>
-                <w:sz w:val="18"/>
-                <w:szCs w:val="18"/>
-              </w:rPr>
-              <w:t>vom Slave</w:t>
-            </w:r>
-            <w:proofErr w:type="gramEnd"/>
+              <w:t>Interrupt Meldung vom Slave</w:t>
+            </w:r>
           </w:p>
         </w:tc>
         <w:tc>
@@ -13998,13 +14111,13 @@
       <w:pPr>
         <w:pStyle w:val="berschrift3"/>
       </w:pPr>
-      <w:bookmarkStart w:id="4" w:name="_Hlk58408187"/>
+      <w:bookmarkStart w:id="5" w:name="_Hlk58408187"/>
       <w:r>
         <w:lastRenderedPageBreak/>
         <w:t>Handshake DTE-DCE</w:t>
       </w:r>
     </w:p>
-    <w:bookmarkEnd w:id="4"/>
+    <w:bookmarkEnd w:id="5"/>
     <w:p>
       <w:pPr>
         <w:jc w:val="both"/>
@@ -14144,15 +14257,7 @@
       </w:r>
       <w:proofErr w:type="spellEnd"/>
       <w:r>
-        <w:t xml:space="preserve">. Ist das Modem irgendwann nicht mehr in der Lage die vom Terminal eintreffenden Daten schnell genug weiterzuverarbeiten, deaktiviert es die Leitung CTS. Daraufhin unterbricht das Terminal den Datentransport </w:t>
-      </w:r>
-      <w:proofErr w:type="gramStart"/>
-      <w:r>
-        <w:t>solange</w:t>
-      </w:r>
-      <w:proofErr w:type="gramEnd"/>
-      <w:r>
-        <w:t xml:space="preserve">, bis CTS wieder vom Modem aktiviert wird. Auf diese Art und Weise verschafft das Modem sich </w:t>
+        <w:t xml:space="preserve">. Ist das Modem irgendwann nicht mehr in der Lage die vom Terminal eintreffenden Daten schnell genug weiterzuverarbeiten, deaktiviert es die Leitung CTS. Daraufhin unterbricht das Terminal den Datentransport solange, bis CTS wieder vom Modem aktiviert wird. Auf diese Art und Weise verschafft das Modem sich </w:t>
       </w:r>
       <w:r>
         <w:t>Pausen für die interne Verarbeitung der Daten</w:t>
@@ -14726,7 +14831,6 @@
                 <w:szCs w:val="18"/>
               </w:rPr>
             </w:pPr>
-            <w:proofErr w:type="gramStart"/>
             <w:r>
               <w:rPr>
                 <w:rFonts w:ascii="Myriad Pro" w:hAnsi="Myriad Pro"/>
@@ -14737,7 +14841,6 @@
               </w:rPr>
               <w:t>ESB Bit</w:t>
             </w:r>
-            <w:proofErr w:type="gramEnd"/>
           </w:p>
         </w:tc>
         <w:tc>
@@ -16767,7 +16870,7 @@
 </file>
 
 <file path=word/endnotes.xml><?xml version="1.0" encoding="utf-8"?>
-<w:endnotes xmlns:wpc="http://schemas.microsoft.com/office/word/2010/wordprocessingCanvas" xmlns:cx="http://schemas.microsoft.com/office/drawing/2014/chartex" xmlns:cx1="http://schemas.microsoft.com/office/drawing/2015/9/8/chartex" xmlns:cx2="http://schemas.microsoft.com/office/drawing/2015/10/21/chartex" xmlns:cx3="http://schemas.microsoft.com/office/drawing/2016/5/9/chartex" xmlns:cx4="http://schemas.microsoft.com/office/drawing/2016/5/10/chartex" xmlns:cx5="http://schemas.microsoft.com/office/drawing/2016/5/11/chartex" xmlns:cx6="http://schemas.microsoft.com/office/drawing/2016/5/12/chartex" xmlns:cx7="http://schemas.microsoft.com/office/drawing/2016/5/13/chartex" xmlns:cx8="http://schemas.microsoft.com/office/drawing/2016/5/14/chartex" xmlns:mc="http://schemas.openxmlformats.org/markup-compatibility/2006" xmlns:aink="http://schemas.microsoft.com/office/drawing/2016/ink" xmlns:am3d="http://schemas.microsoft.com/office/drawing/2017/model3d" xmlns:o="urn:schemas-microsoft-com:office:office" xmlns:oel="http://schemas.microsoft.com/office/2019/extlst" xmlns:r="http://schemas.openxmlformats.org/officeDocument/2006/relationships" xmlns:m="http://schemas.openxmlformats.org/officeDocument/2006/math" xmlns:v="urn:schemas-microsoft-com:vml" xmlns:wp14="http://schemas.microsoft.com/office/word/2010/wordprocessingDrawing" xmlns:wp="http://schemas.openxmlformats.org/drawingml/2006/wordprocessingDrawing" xmlns:w10="urn:schemas-microsoft-com:office:word" xmlns:w="http://schemas.openxmlformats.org/wordprocessingml/2006/main" xmlns:w14="http://schemas.microsoft.com/office/word/2010/wordml" xmlns:w15="http://schemas.microsoft.com/office/word/2012/wordml" xmlns:w16cex="http://schemas.microsoft.com/office/word/2018/wordml/cex" xmlns:w16cid="http://schemas.microsoft.com/office/word/2016/wordml/cid" xmlns:w16="http://schemas.microsoft.com/office/word/2018/wordml" xmlns:w16sdtdh="http://schemas.microsoft.com/office/word/2020/wordml/sdtdatahash" xmlns:w16se="http://schemas.microsoft.com/office/word/2015/wordml/symex" xmlns:wpg="http://schemas.microsoft.com/office/word/2010/wordprocessingGroup" xmlns:wpi="http://schemas.microsoft.com/office/word/2010/wordprocessingInk" xmlns:wne="http://schemas.microsoft.com/office/word/2006/wordml" xmlns:wps="http://schemas.microsoft.com/office/word/2010/wordprocessingShape" mc:Ignorable="w14 w15 w16se w16cid w16 w16cex w16sdtdh wp14">
+<w:endnotes xmlns:wpc="http://schemas.microsoft.com/office/word/2010/wordprocessingCanvas" xmlns:mc="http://schemas.openxmlformats.org/markup-compatibility/2006" xmlns:o="urn:schemas-microsoft-com:office:office" xmlns:r="http://schemas.openxmlformats.org/officeDocument/2006/relationships" xmlns:m="http://schemas.openxmlformats.org/officeDocument/2006/math" xmlns:v="urn:schemas-microsoft-com:vml" xmlns:wp14="http://schemas.microsoft.com/office/word/2010/wordprocessingDrawing" xmlns:wp="http://schemas.openxmlformats.org/drawingml/2006/wordprocessingDrawing" xmlns:w10="urn:schemas-microsoft-com:office:word" xmlns:w="http://schemas.openxmlformats.org/wordprocessingml/2006/main" xmlns:w14="http://schemas.microsoft.com/office/word/2010/wordml" xmlns:w15="http://schemas.microsoft.com/office/word/2012/wordml" xmlns:wpg="http://schemas.microsoft.com/office/word/2010/wordprocessingGroup" xmlns:wpi="http://schemas.microsoft.com/office/word/2010/wordprocessingInk" xmlns:wne="http://schemas.microsoft.com/office/word/2006/wordml" xmlns:wps="http://schemas.microsoft.com/office/word/2010/wordprocessingShape" mc:Ignorable="w14 w15 wp14">
   <w:endnote w:type="separator" w:id="-1">
     <w:p>
       <w:r>
@@ -16786,7 +16889,7 @@
 </file>
 
 <file path=word/footer1.xml><?xml version="1.0" encoding="utf-8"?>
-<w:ftr xmlns:wpc="http://schemas.microsoft.com/office/word/2010/wordprocessingCanvas" xmlns:cx="http://schemas.microsoft.com/office/drawing/2014/chartex" xmlns:cx1="http://schemas.microsoft.com/office/drawing/2015/9/8/chartex" xmlns:cx2="http://schemas.microsoft.com/office/drawing/2015/10/21/chartex" xmlns:cx3="http://schemas.microsoft.com/office/drawing/2016/5/9/chartex" xmlns:cx4="http://schemas.microsoft.com/office/drawing/2016/5/10/chartex" xmlns:cx5="http://schemas.microsoft.com/office/drawing/2016/5/11/chartex" xmlns:cx6="http://schemas.microsoft.com/office/drawing/2016/5/12/chartex" xmlns:cx7="http://schemas.microsoft.com/office/drawing/2016/5/13/chartex" xmlns:cx8="http://schemas.microsoft.com/office/drawing/2016/5/14/chartex" xmlns:mc="http://schemas.openxmlformats.org/markup-compatibility/2006" xmlns:aink="http://schemas.microsoft.com/office/drawing/2016/ink" xmlns:am3d="http://schemas.microsoft.com/office/drawing/2017/model3d" xmlns:o="urn:schemas-microsoft-com:office:office" xmlns:oel="http://schemas.microsoft.com/office/2019/extlst" xmlns:r="http://schemas.openxmlformats.org/officeDocument/2006/relationships" xmlns:m="http://schemas.openxmlformats.org/officeDocument/2006/math" xmlns:v="urn:schemas-microsoft-com:vml" xmlns:wp14="http://schemas.microsoft.com/office/word/2010/wordprocessingDrawing" xmlns:wp="http://schemas.openxmlformats.org/drawingml/2006/wordprocessingDrawing" xmlns:w10="urn:schemas-microsoft-com:office:word" xmlns:w="http://schemas.openxmlformats.org/wordprocessingml/2006/main" xmlns:w14="http://schemas.microsoft.com/office/word/2010/wordml" xmlns:w15="http://schemas.microsoft.com/office/word/2012/wordml" xmlns:w16cex="http://schemas.microsoft.com/office/word/2018/wordml/cex" xmlns:w16cid="http://schemas.microsoft.com/office/word/2016/wordml/cid" xmlns:w16="http://schemas.microsoft.com/office/word/2018/wordml" xmlns:w16sdtdh="http://schemas.microsoft.com/office/word/2020/wordml/sdtdatahash" xmlns:w16se="http://schemas.microsoft.com/office/word/2015/wordml/symex" xmlns:wpg="http://schemas.microsoft.com/office/word/2010/wordprocessingGroup" xmlns:wpi="http://schemas.microsoft.com/office/word/2010/wordprocessingInk" xmlns:wne="http://schemas.microsoft.com/office/word/2006/wordml" xmlns:wps="http://schemas.microsoft.com/office/word/2010/wordprocessingShape" mc:Ignorable="w14 w15 w16se w16cid w16 w16cex w16sdtdh wp14">
+<w:ftr xmlns:wpc="http://schemas.microsoft.com/office/word/2010/wordprocessingCanvas" xmlns:mc="http://schemas.openxmlformats.org/markup-compatibility/2006" xmlns:o="urn:schemas-microsoft-com:office:office" xmlns:r="http://schemas.openxmlformats.org/officeDocument/2006/relationships" xmlns:m="http://schemas.openxmlformats.org/officeDocument/2006/math" xmlns:v="urn:schemas-microsoft-com:vml" xmlns:wp14="http://schemas.microsoft.com/office/word/2010/wordprocessingDrawing" xmlns:wp="http://schemas.openxmlformats.org/drawingml/2006/wordprocessingDrawing" xmlns:w10="urn:schemas-microsoft-com:office:word" xmlns:w="http://schemas.openxmlformats.org/wordprocessingml/2006/main" xmlns:w14="http://schemas.microsoft.com/office/word/2010/wordml" xmlns:w15="http://schemas.microsoft.com/office/word/2012/wordml" xmlns:wpg="http://schemas.microsoft.com/office/word/2010/wordprocessingGroup" xmlns:wpi="http://schemas.microsoft.com/office/word/2010/wordprocessingInk" xmlns:wne="http://schemas.microsoft.com/office/word/2006/wordml" xmlns:wps="http://schemas.microsoft.com/office/word/2010/wordprocessingShape" mc:Ignorable="w14 w15 wp14">
   <w:p>
     <w:pPr>
       <w:pStyle w:val="Fuzeile"/>
@@ -16796,7 +16899,7 @@
 </file>
 
 <file path=word/footer2.xml><?xml version="1.0" encoding="utf-8"?>
-<w:ftr xmlns:wpc="http://schemas.microsoft.com/office/word/2010/wordprocessingCanvas" xmlns:cx="http://schemas.microsoft.com/office/drawing/2014/chartex" xmlns:cx1="http://schemas.microsoft.com/office/drawing/2015/9/8/chartex" xmlns:cx2="http://schemas.microsoft.com/office/drawing/2015/10/21/chartex" xmlns:cx3="http://schemas.microsoft.com/office/drawing/2016/5/9/chartex" xmlns:cx4="http://schemas.microsoft.com/office/drawing/2016/5/10/chartex" xmlns:cx5="http://schemas.microsoft.com/office/drawing/2016/5/11/chartex" xmlns:cx6="http://schemas.microsoft.com/office/drawing/2016/5/12/chartex" xmlns:cx7="http://schemas.microsoft.com/office/drawing/2016/5/13/chartex" xmlns:cx8="http://schemas.microsoft.com/office/drawing/2016/5/14/chartex" xmlns:mc="http://schemas.openxmlformats.org/markup-compatibility/2006" xmlns:aink="http://schemas.microsoft.com/office/drawing/2016/ink" xmlns:am3d="http://schemas.microsoft.com/office/drawing/2017/model3d" xmlns:o="urn:schemas-microsoft-com:office:office" xmlns:oel="http://schemas.microsoft.com/office/2019/extlst" xmlns:r="http://schemas.openxmlformats.org/officeDocument/2006/relationships" xmlns:m="http://schemas.openxmlformats.org/officeDocument/2006/math" xmlns:v="urn:schemas-microsoft-com:vml" xmlns:wp14="http://schemas.microsoft.com/office/word/2010/wordprocessingDrawing" xmlns:wp="http://schemas.openxmlformats.org/drawingml/2006/wordprocessingDrawing" xmlns:w10="urn:schemas-microsoft-com:office:word" xmlns:w="http://schemas.openxmlformats.org/wordprocessingml/2006/main" xmlns:w14="http://schemas.microsoft.com/office/word/2010/wordml" xmlns:w15="http://schemas.microsoft.com/office/word/2012/wordml" xmlns:w16cex="http://schemas.microsoft.com/office/word/2018/wordml/cex" xmlns:w16cid="http://schemas.microsoft.com/office/word/2016/wordml/cid" xmlns:w16="http://schemas.microsoft.com/office/word/2018/wordml" xmlns:w16sdtdh="http://schemas.microsoft.com/office/word/2020/wordml/sdtdatahash" xmlns:w16se="http://schemas.microsoft.com/office/word/2015/wordml/symex" xmlns:wpg="http://schemas.microsoft.com/office/word/2010/wordprocessingGroup" xmlns:wpi="http://schemas.microsoft.com/office/word/2010/wordprocessingInk" xmlns:wne="http://schemas.microsoft.com/office/word/2006/wordml" xmlns:wps="http://schemas.microsoft.com/office/word/2010/wordprocessingShape" mc:Ignorable="w14 w15 w16se w16cid w16 w16cex w16sdtdh wp14">
+<w:ftr xmlns:wpc="http://schemas.microsoft.com/office/word/2010/wordprocessingCanvas" xmlns:mc="http://schemas.openxmlformats.org/markup-compatibility/2006" xmlns:o="urn:schemas-microsoft-com:office:office" xmlns:r="http://schemas.openxmlformats.org/officeDocument/2006/relationships" xmlns:m="http://schemas.openxmlformats.org/officeDocument/2006/math" xmlns:v="urn:schemas-microsoft-com:vml" xmlns:wp14="http://schemas.microsoft.com/office/word/2010/wordprocessingDrawing" xmlns:wp="http://schemas.openxmlformats.org/drawingml/2006/wordprocessingDrawing" xmlns:w10="urn:schemas-microsoft-com:office:word" xmlns:w="http://schemas.openxmlformats.org/wordprocessingml/2006/main" xmlns:w14="http://schemas.microsoft.com/office/word/2010/wordml" xmlns:w15="http://schemas.microsoft.com/office/word/2012/wordml" xmlns:wpg="http://schemas.microsoft.com/office/word/2010/wordprocessingGroup" xmlns:wpi="http://schemas.microsoft.com/office/word/2010/wordprocessingInk" xmlns:wne="http://schemas.microsoft.com/office/word/2006/wordml" xmlns:wps="http://schemas.microsoft.com/office/word/2010/wordprocessingShape" mc:Ignorable="w14 w15 wp14">
   <w:p>
     <w:pPr>
       <w:pStyle w:val="Fuzeile"/>
@@ -16832,7 +16935,7 @@
         <w:sz w:val="20"/>
         <w:szCs w:val="20"/>
       </w:rPr>
-      <w:t>1</w:t>
+      <w:t>6</w:t>
     </w:r>
     <w:r>
       <w:rPr>
@@ -16922,7 +17025,7 @@
 </file>
 
 <file path=word/footer3.xml><?xml version="1.0" encoding="utf-8"?>
-<w:ftr xmlns:wpc="http://schemas.microsoft.com/office/word/2010/wordprocessingCanvas" xmlns:cx="http://schemas.microsoft.com/office/drawing/2014/chartex" xmlns:cx1="http://schemas.microsoft.com/office/drawing/2015/9/8/chartex" xmlns:cx2="http://schemas.microsoft.com/office/drawing/2015/10/21/chartex" xmlns:cx3="http://schemas.microsoft.com/office/drawing/2016/5/9/chartex" xmlns:cx4="http://schemas.microsoft.com/office/drawing/2016/5/10/chartex" xmlns:cx5="http://schemas.microsoft.com/office/drawing/2016/5/11/chartex" xmlns:cx6="http://schemas.microsoft.com/office/drawing/2016/5/12/chartex" xmlns:cx7="http://schemas.microsoft.com/office/drawing/2016/5/13/chartex" xmlns:cx8="http://schemas.microsoft.com/office/drawing/2016/5/14/chartex" xmlns:mc="http://schemas.openxmlformats.org/markup-compatibility/2006" xmlns:aink="http://schemas.microsoft.com/office/drawing/2016/ink" xmlns:am3d="http://schemas.microsoft.com/office/drawing/2017/model3d" xmlns:o="urn:schemas-microsoft-com:office:office" xmlns:oel="http://schemas.microsoft.com/office/2019/extlst" xmlns:r="http://schemas.openxmlformats.org/officeDocument/2006/relationships" xmlns:m="http://schemas.openxmlformats.org/officeDocument/2006/math" xmlns:v="urn:schemas-microsoft-com:vml" xmlns:wp14="http://schemas.microsoft.com/office/word/2010/wordprocessingDrawing" xmlns:wp="http://schemas.openxmlformats.org/drawingml/2006/wordprocessingDrawing" xmlns:w10="urn:schemas-microsoft-com:office:word" xmlns:w="http://schemas.openxmlformats.org/wordprocessingml/2006/main" xmlns:w14="http://schemas.microsoft.com/office/word/2010/wordml" xmlns:w15="http://schemas.microsoft.com/office/word/2012/wordml" xmlns:w16cex="http://schemas.microsoft.com/office/word/2018/wordml/cex" xmlns:w16cid="http://schemas.microsoft.com/office/word/2016/wordml/cid" xmlns:w16="http://schemas.microsoft.com/office/word/2018/wordml" xmlns:w16sdtdh="http://schemas.microsoft.com/office/word/2020/wordml/sdtdatahash" xmlns:w16se="http://schemas.microsoft.com/office/word/2015/wordml/symex" xmlns:wpg="http://schemas.microsoft.com/office/word/2010/wordprocessingGroup" xmlns:wpi="http://schemas.microsoft.com/office/word/2010/wordprocessingInk" xmlns:wne="http://schemas.microsoft.com/office/word/2006/wordml" xmlns:wps="http://schemas.microsoft.com/office/word/2010/wordprocessingShape" mc:Ignorable="w14 w15 w16se w16cid w16 w16cex w16sdtdh wp14">
+<w:ftr xmlns:wpc="http://schemas.microsoft.com/office/word/2010/wordprocessingCanvas" xmlns:mc="http://schemas.openxmlformats.org/markup-compatibility/2006" xmlns:o="urn:schemas-microsoft-com:office:office" xmlns:r="http://schemas.openxmlformats.org/officeDocument/2006/relationships" xmlns:m="http://schemas.openxmlformats.org/officeDocument/2006/math" xmlns:v="urn:schemas-microsoft-com:vml" xmlns:wp14="http://schemas.microsoft.com/office/word/2010/wordprocessingDrawing" xmlns:wp="http://schemas.openxmlformats.org/drawingml/2006/wordprocessingDrawing" xmlns:w10="urn:schemas-microsoft-com:office:word" xmlns:w="http://schemas.openxmlformats.org/wordprocessingml/2006/main" xmlns:w14="http://schemas.microsoft.com/office/word/2010/wordml" xmlns:w15="http://schemas.microsoft.com/office/word/2012/wordml" xmlns:wpg="http://schemas.microsoft.com/office/word/2010/wordprocessingGroup" xmlns:wpi="http://schemas.microsoft.com/office/word/2010/wordprocessingInk" xmlns:wne="http://schemas.microsoft.com/office/word/2006/wordml" xmlns:wps="http://schemas.microsoft.com/office/word/2010/wordprocessingShape" mc:Ignorable="w14 w15 wp14">
   <w:p>
     <w:pPr>
       <w:pStyle w:val="Fuzeile"/>
@@ -16932,7 +17035,7 @@
 </file>
 
 <file path=word/footnotes.xml><?xml version="1.0" encoding="utf-8"?>
-<w:footnotes xmlns:wpc="http://schemas.microsoft.com/office/word/2010/wordprocessingCanvas" xmlns:cx="http://schemas.microsoft.com/office/drawing/2014/chartex" xmlns:cx1="http://schemas.microsoft.com/office/drawing/2015/9/8/chartex" xmlns:cx2="http://schemas.microsoft.com/office/drawing/2015/10/21/chartex" xmlns:cx3="http://schemas.microsoft.com/office/drawing/2016/5/9/chartex" xmlns:cx4="http://schemas.microsoft.com/office/drawing/2016/5/10/chartex" xmlns:cx5="http://schemas.microsoft.com/office/drawing/2016/5/11/chartex" xmlns:cx6="http://schemas.microsoft.com/office/drawing/2016/5/12/chartex" xmlns:cx7="http://schemas.microsoft.com/office/drawing/2016/5/13/chartex" xmlns:cx8="http://schemas.microsoft.com/office/drawing/2016/5/14/chartex" xmlns:mc="http://schemas.openxmlformats.org/markup-compatibility/2006" xmlns:aink="http://schemas.microsoft.com/office/drawing/2016/ink" xmlns:am3d="http://schemas.microsoft.com/office/drawing/2017/model3d" xmlns:o="urn:schemas-microsoft-com:office:office" xmlns:oel="http://schemas.microsoft.com/office/2019/extlst" xmlns:r="http://schemas.openxmlformats.org/officeDocument/2006/relationships" xmlns:m="http://schemas.openxmlformats.org/officeDocument/2006/math" xmlns:v="urn:schemas-microsoft-com:vml" xmlns:wp14="http://schemas.microsoft.com/office/word/2010/wordprocessingDrawing" xmlns:wp="http://schemas.openxmlformats.org/drawingml/2006/wordprocessingDrawing" xmlns:w10="urn:schemas-microsoft-com:office:word" xmlns:w="http://schemas.openxmlformats.org/wordprocessingml/2006/main" xmlns:w14="http://schemas.microsoft.com/office/word/2010/wordml" xmlns:w15="http://schemas.microsoft.com/office/word/2012/wordml" xmlns:w16cex="http://schemas.microsoft.com/office/word/2018/wordml/cex" xmlns:w16cid="http://schemas.microsoft.com/office/word/2016/wordml/cid" xmlns:w16="http://schemas.microsoft.com/office/word/2018/wordml" xmlns:w16sdtdh="http://schemas.microsoft.com/office/word/2020/wordml/sdtdatahash" xmlns:w16se="http://schemas.microsoft.com/office/word/2015/wordml/symex" xmlns:wpg="http://schemas.microsoft.com/office/word/2010/wordprocessingGroup" xmlns:wpi="http://schemas.microsoft.com/office/word/2010/wordprocessingInk" xmlns:wne="http://schemas.microsoft.com/office/word/2006/wordml" xmlns:wps="http://schemas.microsoft.com/office/word/2010/wordprocessingShape" mc:Ignorable="w14 w15 w16se w16cid w16 w16cex w16sdtdh wp14">
+<w:footnotes xmlns:wpc="http://schemas.microsoft.com/office/word/2010/wordprocessingCanvas" xmlns:mc="http://schemas.openxmlformats.org/markup-compatibility/2006" xmlns:o="urn:schemas-microsoft-com:office:office" xmlns:r="http://schemas.openxmlformats.org/officeDocument/2006/relationships" xmlns:m="http://schemas.openxmlformats.org/officeDocument/2006/math" xmlns:v="urn:schemas-microsoft-com:vml" xmlns:wp14="http://schemas.microsoft.com/office/word/2010/wordprocessingDrawing" xmlns:wp="http://schemas.openxmlformats.org/drawingml/2006/wordprocessingDrawing" xmlns:w10="urn:schemas-microsoft-com:office:word" xmlns:w="http://schemas.openxmlformats.org/wordprocessingml/2006/main" xmlns:w14="http://schemas.microsoft.com/office/word/2010/wordml" xmlns:w15="http://schemas.microsoft.com/office/word/2012/wordml" xmlns:wpg="http://schemas.microsoft.com/office/word/2010/wordprocessingGroup" xmlns:wpi="http://schemas.microsoft.com/office/word/2010/wordprocessingInk" xmlns:wne="http://schemas.microsoft.com/office/word/2006/wordml" xmlns:wps="http://schemas.microsoft.com/office/word/2010/wordprocessingShape" mc:Ignorable="w14 w15 wp14">
   <w:footnote w:type="separator" w:id="-1">
     <w:p>
       <w:r>
@@ -16951,7 +17054,7 @@
 </file>
 
 <file path=word/header1.xml><?xml version="1.0" encoding="utf-8"?>
-<w:hdr xmlns:wpc="http://schemas.microsoft.com/office/word/2010/wordprocessingCanvas" xmlns:cx="http://schemas.microsoft.com/office/drawing/2014/chartex" xmlns:cx1="http://schemas.microsoft.com/office/drawing/2015/9/8/chartex" xmlns:cx2="http://schemas.microsoft.com/office/drawing/2015/10/21/chartex" xmlns:cx3="http://schemas.microsoft.com/office/drawing/2016/5/9/chartex" xmlns:cx4="http://schemas.microsoft.com/office/drawing/2016/5/10/chartex" xmlns:cx5="http://schemas.microsoft.com/office/drawing/2016/5/11/chartex" xmlns:cx6="http://schemas.microsoft.com/office/drawing/2016/5/12/chartex" xmlns:cx7="http://schemas.microsoft.com/office/drawing/2016/5/13/chartex" xmlns:cx8="http://schemas.microsoft.com/office/drawing/2016/5/14/chartex" xmlns:mc="http://schemas.openxmlformats.org/markup-compatibility/2006" xmlns:aink="http://schemas.microsoft.com/office/drawing/2016/ink" xmlns:am3d="http://schemas.microsoft.com/office/drawing/2017/model3d" xmlns:o="urn:schemas-microsoft-com:office:office" xmlns:oel="http://schemas.microsoft.com/office/2019/extlst" xmlns:r="http://schemas.openxmlformats.org/officeDocument/2006/relationships" xmlns:m="http://schemas.openxmlformats.org/officeDocument/2006/math" xmlns:v="urn:schemas-microsoft-com:vml" xmlns:wp14="http://schemas.microsoft.com/office/word/2010/wordprocessingDrawing" xmlns:wp="http://schemas.openxmlformats.org/drawingml/2006/wordprocessingDrawing" xmlns:w10="urn:schemas-microsoft-com:office:word" xmlns:w="http://schemas.openxmlformats.org/wordprocessingml/2006/main" xmlns:w14="http://schemas.microsoft.com/office/word/2010/wordml" xmlns:w15="http://schemas.microsoft.com/office/word/2012/wordml" xmlns:w16cex="http://schemas.microsoft.com/office/word/2018/wordml/cex" xmlns:w16cid="http://schemas.microsoft.com/office/word/2016/wordml/cid" xmlns:w16="http://schemas.microsoft.com/office/word/2018/wordml" xmlns:w16sdtdh="http://schemas.microsoft.com/office/word/2020/wordml/sdtdatahash" xmlns:w16se="http://schemas.microsoft.com/office/word/2015/wordml/symex" xmlns:wpg="http://schemas.microsoft.com/office/word/2010/wordprocessingGroup" xmlns:wpi="http://schemas.microsoft.com/office/word/2010/wordprocessingInk" xmlns:wne="http://schemas.microsoft.com/office/word/2006/wordml" xmlns:wps="http://schemas.microsoft.com/office/word/2010/wordprocessingShape" mc:Ignorable="w14 w15 w16se w16cid w16 w16cex w16sdtdh wp14">
+<w:hdr xmlns:wpc="http://schemas.microsoft.com/office/word/2010/wordprocessingCanvas" xmlns:mc="http://schemas.openxmlformats.org/markup-compatibility/2006" xmlns:o="urn:schemas-microsoft-com:office:office" xmlns:r="http://schemas.openxmlformats.org/officeDocument/2006/relationships" xmlns:m="http://schemas.openxmlformats.org/officeDocument/2006/math" xmlns:v="urn:schemas-microsoft-com:vml" xmlns:wp14="http://schemas.microsoft.com/office/word/2010/wordprocessingDrawing" xmlns:wp="http://schemas.openxmlformats.org/drawingml/2006/wordprocessingDrawing" xmlns:w10="urn:schemas-microsoft-com:office:word" xmlns:w="http://schemas.openxmlformats.org/wordprocessingml/2006/main" xmlns:w14="http://schemas.microsoft.com/office/word/2010/wordml" xmlns:w15="http://schemas.microsoft.com/office/word/2012/wordml" xmlns:wpg="http://schemas.microsoft.com/office/word/2010/wordprocessingGroup" xmlns:wpi="http://schemas.microsoft.com/office/word/2010/wordprocessingInk" xmlns:wne="http://schemas.microsoft.com/office/word/2006/wordml" xmlns:wps="http://schemas.microsoft.com/office/word/2010/wordprocessingShape" mc:Ignorable="w14 w15 wp14">
   <w:p>
     <w:pPr>
       <w:pStyle w:val="Kopfzeile"/>
@@ -16961,7 +17064,7 @@
 </file>
 
 <file path=word/header2.xml><?xml version="1.0" encoding="utf-8"?>
-<w:hdr xmlns:wpc="http://schemas.microsoft.com/office/word/2010/wordprocessingCanvas" xmlns:cx="http://schemas.microsoft.com/office/drawing/2014/chartex" xmlns:cx1="http://schemas.microsoft.com/office/drawing/2015/9/8/chartex" xmlns:cx2="http://schemas.microsoft.com/office/drawing/2015/10/21/chartex" xmlns:cx3="http://schemas.microsoft.com/office/drawing/2016/5/9/chartex" xmlns:cx4="http://schemas.microsoft.com/office/drawing/2016/5/10/chartex" xmlns:cx5="http://schemas.microsoft.com/office/drawing/2016/5/11/chartex" xmlns:cx6="http://schemas.microsoft.com/office/drawing/2016/5/12/chartex" xmlns:cx7="http://schemas.microsoft.com/office/drawing/2016/5/13/chartex" xmlns:cx8="http://schemas.microsoft.com/office/drawing/2016/5/14/chartex" xmlns:mc="http://schemas.openxmlformats.org/markup-compatibility/2006" xmlns:aink="http://schemas.microsoft.com/office/drawing/2016/ink" xmlns:am3d="http://schemas.microsoft.com/office/drawing/2017/model3d" xmlns:o="urn:schemas-microsoft-com:office:office" xmlns:oel="http://schemas.microsoft.com/office/2019/extlst" xmlns:r="http://schemas.openxmlformats.org/officeDocument/2006/relationships" xmlns:m="http://schemas.openxmlformats.org/officeDocument/2006/math" xmlns:v="urn:schemas-microsoft-com:vml" xmlns:wp14="http://schemas.microsoft.com/office/word/2010/wordprocessingDrawing" xmlns:wp="http://schemas.openxmlformats.org/drawingml/2006/wordprocessingDrawing" xmlns:w10="urn:schemas-microsoft-com:office:word" xmlns:w="http://schemas.openxmlformats.org/wordprocessingml/2006/main" xmlns:w14="http://schemas.microsoft.com/office/word/2010/wordml" xmlns:w15="http://schemas.microsoft.com/office/word/2012/wordml" xmlns:w16cex="http://schemas.microsoft.com/office/word/2018/wordml/cex" xmlns:w16cid="http://schemas.microsoft.com/office/word/2016/wordml/cid" xmlns:w16="http://schemas.microsoft.com/office/word/2018/wordml" xmlns:w16sdtdh="http://schemas.microsoft.com/office/word/2020/wordml/sdtdatahash" xmlns:w16se="http://schemas.microsoft.com/office/word/2015/wordml/symex" xmlns:wpg="http://schemas.microsoft.com/office/word/2010/wordprocessingGroup" xmlns:wpi="http://schemas.microsoft.com/office/word/2010/wordprocessingInk" xmlns:wne="http://schemas.microsoft.com/office/word/2006/wordml" xmlns:wps="http://schemas.microsoft.com/office/word/2010/wordprocessingShape" mc:Ignorable="w14 w15 w16se w16cid w16 w16cex w16sdtdh wp14">
+<w:hdr xmlns:wpc="http://schemas.microsoft.com/office/word/2010/wordprocessingCanvas" xmlns:mc="http://schemas.openxmlformats.org/markup-compatibility/2006" xmlns:o="urn:schemas-microsoft-com:office:office" xmlns:r="http://schemas.openxmlformats.org/officeDocument/2006/relationships" xmlns:m="http://schemas.openxmlformats.org/officeDocument/2006/math" xmlns:v="urn:schemas-microsoft-com:vml" xmlns:wp14="http://schemas.microsoft.com/office/word/2010/wordprocessingDrawing" xmlns:wp="http://schemas.openxmlformats.org/drawingml/2006/wordprocessingDrawing" xmlns:w10="urn:schemas-microsoft-com:office:word" xmlns:w="http://schemas.openxmlformats.org/wordprocessingml/2006/main" xmlns:w14="http://schemas.microsoft.com/office/word/2010/wordml" xmlns:w15="http://schemas.microsoft.com/office/word/2012/wordml" xmlns:wpg="http://schemas.microsoft.com/office/word/2010/wordprocessingGroup" xmlns:wpi="http://schemas.microsoft.com/office/word/2010/wordprocessingInk" xmlns:wne="http://schemas.microsoft.com/office/word/2006/wordml" xmlns:wps="http://schemas.microsoft.com/office/word/2010/wordprocessingShape" mc:Ignorable="w14 w15 wp14">
   <w:p>
     <w:pPr>
       <w:pStyle w:val="Kopfzeile"/>
@@ -17003,7 +17106,7 @@
         <w:sz w:val="20"/>
         <w:szCs w:val="20"/>
       </w:rPr>
-      <w:t>07.06.2023</w:t>
+      <w:t>13.07.2023</w:t>
     </w:r>
     <w:r>
       <w:rPr>
@@ -17049,7 +17152,7 @@
 </file>
 
 <file path=word/header3.xml><?xml version="1.0" encoding="utf-8"?>
-<w:hdr xmlns:wpc="http://schemas.microsoft.com/office/word/2010/wordprocessingCanvas" xmlns:cx="http://schemas.microsoft.com/office/drawing/2014/chartex" xmlns:cx1="http://schemas.microsoft.com/office/drawing/2015/9/8/chartex" xmlns:cx2="http://schemas.microsoft.com/office/drawing/2015/10/21/chartex" xmlns:cx3="http://schemas.microsoft.com/office/drawing/2016/5/9/chartex" xmlns:cx4="http://schemas.microsoft.com/office/drawing/2016/5/10/chartex" xmlns:cx5="http://schemas.microsoft.com/office/drawing/2016/5/11/chartex" xmlns:cx6="http://schemas.microsoft.com/office/drawing/2016/5/12/chartex" xmlns:cx7="http://schemas.microsoft.com/office/drawing/2016/5/13/chartex" xmlns:cx8="http://schemas.microsoft.com/office/drawing/2016/5/14/chartex" xmlns:mc="http://schemas.openxmlformats.org/markup-compatibility/2006" xmlns:aink="http://schemas.microsoft.com/office/drawing/2016/ink" xmlns:am3d="http://schemas.microsoft.com/office/drawing/2017/model3d" xmlns:o="urn:schemas-microsoft-com:office:office" xmlns:oel="http://schemas.microsoft.com/office/2019/extlst" xmlns:r="http://schemas.openxmlformats.org/officeDocument/2006/relationships" xmlns:m="http://schemas.openxmlformats.org/officeDocument/2006/math" xmlns:v="urn:schemas-microsoft-com:vml" xmlns:wp14="http://schemas.microsoft.com/office/word/2010/wordprocessingDrawing" xmlns:wp="http://schemas.openxmlformats.org/drawingml/2006/wordprocessingDrawing" xmlns:w10="urn:schemas-microsoft-com:office:word" xmlns:w="http://schemas.openxmlformats.org/wordprocessingml/2006/main" xmlns:w14="http://schemas.microsoft.com/office/word/2010/wordml" xmlns:w15="http://schemas.microsoft.com/office/word/2012/wordml" xmlns:w16cex="http://schemas.microsoft.com/office/word/2018/wordml/cex" xmlns:w16cid="http://schemas.microsoft.com/office/word/2016/wordml/cid" xmlns:w16="http://schemas.microsoft.com/office/word/2018/wordml" xmlns:w16sdtdh="http://schemas.microsoft.com/office/word/2020/wordml/sdtdatahash" xmlns:w16se="http://schemas.microsoft.com/office/word/2015/wordml/symex" xmlns:wpg="http://schemas.microsoft.com/office/word/2010/wordprocessingGroup" xmlns:wpi="http://schemas.microsoft.com/office/word/2010/wordprocessingInk" xmlns:wne="http://schemas.microsoft.com/office/word/2006/wordml" xmlns:wps="http://schemas.microsoft.com/office/word/2010/wordprocessingShape" mc:Ignorable="w14 w15 w16se w16cid w16 w16cex w16sdtdh wp14">
+<w:hdr xmlns:wpc="http://schemas.microsoft.com/office/word/2010/wordprocessingCanvas" xmlns:mc="http://schemas.openxmlformats.org/markup-compatibility/2006" xmlns:o="urn:schemas-microsoft-com:office:office" xmlns:r="http://schemas.openxmlformats.org/officeDocument/2006/relationships" xmlns:m="http://schemas.openxmlformats.org/officeDocument/2006/math" xmlns:v="urn:schemas-microsoft-com:vml" xmlns:wp14="http://schemas.microsoft.com/office/word/2010/wordprocessingDrawing" xmlns:wp="http://schemas.openxmlformats.org/drawingml/2006/wordprocessingDrawing" xmlns:w10="urn:schemas-microsoft-com:office:word" xmlns:w="http://schemas.openxmlformats.org/wordprocessingml/2006/main" xmlns:w14="http://schemas.microsoft.com/office/word/2010/wordml" xmlns:w15="http://schemas.microsoft.com/office/word/2012/wordml" xmlns:wpg="http://schemas.microsoft.com/office/word/2010/wordprocessingGroup" xmlns:wpi="http://schemas.microsoft.com/office/word/2010/wordprocessingInk" xmlns:wne="http://schemas.microsoft.com/office/word/2006/wordml" xmlns:wps="http://schemas.microsoft.com/office/word/2010/wordprocessingShape" mc:Ignorable="w14 w15 wp14">
   <w:p>
     <w:pPr>
       <w:pStyle w:val="Kopfzeile"/>
@@ -17059,7 +17162,7 @@
 </file>
 
 <file path=word/numbering.xml><?xml version="1.0" encoding="utf-8"?>
-<w:numbering xmlns:wpc="http://schemas.microsoft.com/office/word/2010/wordprocessingCanvas" xmlns:cx="http://schemas.microsoft.com/office/drawing/2014/chartex" xmlns:cx1="http://schemas.microsoft.com/office/drawing/2015/9/8/chartex" xmlns:cx2="http://schemas.microsoft.com/office/drawing/2015/10/21/chartex" xmlns:cx3="http://schemas.microsoft.com/office/drawing/2016/5/9/chartex" xmlns:cx4="http://schemas.microsoft.com/office/drawing/2016/5/10/chartex" xmlns:cx5="http://schemas.microsoft.com/office/drawing/2016/5/11/chartex" xmlns:cx6="http://schemas.microsoft.com/office/drawing/2016/5/12/chartex" xmlns:cx7="http://schemas.microsoft.com/office/drawing/2016/5/13/chartex" xmlns:cx8="http://schemas.microsoft.com/office/drawing/2016/5/14/chartex" xmlns:mc="http://schemas.openxmlformats.org/markup-compatibility/2006" xmlns:aink="http://schemas.microsoft.com/office/drawing/2016/ink" xmlns:am3d="http://schemas.microsoft.com/office/drawing/2017/model3d" xmlns:o="urn:schemas-microsoft-com:office:office" xmlns:oel="http://schemas.microsoft.com/office/2019/extlst" xmlns:r="http://schemas.openxmlformats.org/officeDocument/2006/relationships" xmlns:m="http://schemas.openxmlformats.org/officeDocument/2006/math" xmlns:v="urn:schemas-microsoft-com:vml" xmlns:wp14="http://schemas.microsoft.com/office/word/2010/wordprocessingDrawing" xmlns:wp="http://schemas.openxmlformats.org/drawingml/2006/wordprocessingDrawing" xmlns:w10="urn:schemas-microsoft-com:office:word" xmlns:w="http://schemas.openxmlformats.org/wordprocessingml/2006/main" xmlns:w14="http://schemas.microsoft.com/office/word/2010/wordml" xmlns:w15="http://schemas.microsoft.com/office/word/2012/wordml" xmlns:w16cex="http://schemas.microsoft.com/office/word/2018/wordml/cex" xmlns:w16cid="http://schemas.microsoft.com/office/word/2016/wordml/cid" xmlns:w16="http://schemas.microsoft.com/office/word/2018/wordml" xmlns:w16sdtdh="http://schemas.microsoft.com/office/word/2020/wordml/sdtdatahash" xmlns:w16se="http://schemas.microsoft.com/office/word/2015/wordml/symex" xmlns:wpg="http://schemas.microsoft.com/office/word/2010/wordprocessingGroup" xmlns:wpi="http://schemas.microsoft.com/office/word/2010/wordprocessingInk" xmlns:wne="http://schemas.microsoft.com/office/word/2006/wordml" xmlns:wps="http://schemas.microsoft.com/office/word/2010/wordprocessingShape" mc:Ignorable="w14 w15 w16se w16cid w16 w16cex w16sdtdh wp14">
+<w:numbering xmlns:wpc="http://schemas.microsoft.com/office/word/2010/wordprocessingCanvas" xmlns:mc="http://schemas.openxmlformats.org/markup-compatibility/2006" xmlns:o="urn:schemas-microsoft-com:office:office" xmlns:r="http://schemas.openxmlformats.org/officeDocument/2006/relationships" xmlns:m="http://schemas.openxmlformats.org/officeDocument/2006/math" xmlns:v="urn:schemas-microsoft-com:vml" xmlns:wp14="http://schemas.microsoft.com/office/word/2010/wordprocessingDrawing" xmlns:wp="http://schemas.openxmlformats.org/drawingml/2006/wordprocessingDrawing" xmlns:w10="urn:schemas-microsoft-com:office:word" xmlns:w="http://schemas.openxmlformats.org/wordprocessingml/2006/main" xmlns:w14="http://schemas.microsoft.com/office/word/2010/wordml" xmlns:w15="http://schemas.microsoft.com/office/word/2012/wordml" xmlns:wpg="http://schemas.microsoft.com/office/word/2010/wordprocessingGroup" xmlns:wpi="http://schemas.microsoft.com/office/word/2010/wordprocessingInk" xmlns:wne="http://schemas.microsoft.com/office/word/2006/wordml" xmlns:wps="http://schemas.microsoft.com/office/word/2010/wordprocessingShape" mc:Ignorable="w14 w15 wp14">
   <w:abstractNum w:abstractNumId="0" w15:restartNumberingAfterBreak="0">
     <w:nsid w:val="2B2E3BDF"/>
     <w:multiLevelType w:val="hybridMultilevel"/>
@@ -17488,23 +17591,23 @@
       </w:rPr>
     </w:lvl>
   </w:abstractNum>
-  <w:num w:numId="1" w16cid:durableId="280841391">
+  <w:num w:numId="1">
     <w:abstractNumId w:val="0"/>
   </w:num>
-  <w:num w:numId="2" w16cid:durableId="1028291989">
+  <w:num w:numId="2">
     <w:abstractNumId w:val="2"/>
   </w:num>
-  <w:num w:numId="3" w16cid:durableId="1770932582">
+  <w:num w:numId="3">
     <w:abstractNumId w:val="3"/>
   </w:num>
-  <w:num w:numId="4" w16cid:durableId="123040947">
+  <w:num w:numId="4">
     <w:abstractNumId w:val="1"/>
   </w:num>
 </w:numbering>
 </file>
 
 <file path=word/styles.xml><?xml version="1.0" encoding="utf-8"?>
-<w:styles xmlns:mc="http://schemas.openxmlformats.org/markup-compatibility/2006" xmlns:r="http://schemas.openxmlformats.org/officeDocument/2006/relationships" xmlns:w="http://schemas.openxmlformats.org/wordprocessingml/2006/main" xmlns:w14="http://schemas.microsoft.com/office/word/2010/wordml" xmlns:w15="http://schemas.microsoft.com/office/word/2012/wordml" xmlns:w16cex="http://schemas.microsoft.com/office/word/2018/wordml/cex" xmlns:w16cid="http://schemas.microsoft.com/office/word/2016/wordml/cid" xmlns:w16="http://schemas.microsoft.com/office/word/2018/wordml" xmlns:w16sdtdh="http://schemas.microsoft.com/office/word/2020/wordml/sdtdatahash" xmlns:w16se="http://schemas.microsoft.com/office/word/2015/wordml/symex" mc:Ignorable="w14 w15 w16se w16cid w16 w16cex w16sdtdh">
+<w:styles xmlns:mc="http://schemas.openxmlformats.org/markup-compatibility/2006" xmlns:r="http://schemas.openxmlformats.org/officeDocument/2006/relationships" xmlns:w="http://schemas.openxmlformats.org/wordprocessingml/2006/main" xmlns:w14="http://schemas.microsoft.com/office/word/2010/wordml" xmlns:w15="http://schemas.microsoft.com/office/word/2012/wordml" mc:Ignorable="w14 w15">
   <w:docDefaults>
     <w:rPrDefault>
       <w:rPr>
@@ -17516,7 +17619,7 @@
     </w:rPrDefault>
     <w:pPrDefault/>
   </w:docDefaults>
-  <w:latentStyles w:defLockedState="0" w:defUIPriority="99" w:defSemiHidden="0" w:defUnhideWhenUsed="0" w:defQFormat="0" w:count="376">
+  <w:latentStyles w:defLockedState="0" w:defUIPriority="99" w:defSemiHidden="0" w:defUnhideWhenUsed="0" w:defQFormat="0" w:count="371">
     <w:lsdException w:name="Normal" w:uiPriority="0" w:qFormat="1"/>
     <w:lsdException w:name="heading 1" w:uiPriority="9" w:qFormat="1"/>
     <w:lsdException w:name="heading 2" w:semiHidden="1" w:uiPriority="9" w:unhideWhenUsed="1" w:qFormat="1"/>
@@ -17888,11 +17991,6 @@
     <w:lsdException w:name="List Table 5 Dark Accent 6" w:uiPriority="50"/>
     <w:lsdException w:name="List Table 6 Colorful Accent 6" w:uiPriority="51"/>
     <w:lsdException w:name="List Table 7 Colorful Accent 6" w:uiPriority="52"/>
-    <w:lsdException w:name="Mention" w:semiHidden="1" w:unhideWhenUsed="1"/>
-    <w:lsdException w:name="Smart Hyperlink" w:semiHidden="1" w:unhideWhenUsed="1"/>
-    <w:lsdException w:name="Hashtag" w:semiHidden="1" w:unhideWhenUsed="1"/>
-    <w:lsdException w:name="Unresolved Mention" w:semiHidden="1" w:unhideWhenUsed="1"/>
-    <w:lsdException w:name="Smart Link" w:semiHidden="1" w:unhideWhenUsed="1"/>
   </w:latentStyles>
   <w:style w:type="paragraph" w:default="1" w:styleId="Standard">
     <w:name w:val="Normal"/>
@@ -18675,7 +18773,7 @@
 </file>
 
 <file path=word/glossary/document.xml><?xml version="1.0" encoding="utf-8"?>
-<w:glossaryDocument xmlns:wpc="http://schemas.microsoft.com/office/word/2010/wordprocessingCanvas" xmlns:cx="http://schemas.microsoft.com/office/drawing/2014/chartex" xmlns:cx1="http://schemas.microsoft.com/office/drawing/2015/9/8/chartex" xmlns:cx2="http://schemas.microsoft.com/office/drawing/2015/10/21/chartex" xmlns:cx3="http://schemas.microsoft.com/office/drawing/2016/5/9/chartex" xmlns:cx4="http://schemas.microsoft.com/office/drawing/2016/5/10/chartex" xmlns:cx5="http://schemas.microsoft.com/office/drawing/2016/5/11/chartex" xmlns:cx6="http://schemas.microsoft.com/office/drawing/2016/5/12/chartex" xmlns:cx7="http://schemas.microsoft.com/office/drawing/2016/5/13/chartex" xmlns:cx8="http://schemas.microsoft.com/office/drawing/2016/5/14/chartex" xmlns:mc="http://schemas.openxmlformats.org/markup-compatibility/2006" xmlns:aink="http://schemas.microsoft.com/office/drawing/2016/ink" xmlns:am3d="http://schemas.microsoft.com/office/drawing/2017/model3d" xmlns:o="urn:schemas-microsoft-com:office:office" xmlns:oel="http://schemas.microsoft.com/office/2019/extlst" xmlns:r="http://schemas.openxmlformats.org/officeDocument/2006/relationships" xmlns:m="http://schemas.openxmlformats.org/officeDocument/2006/math" xmlns:v="urn:schemas-microsoft-com:vml" xmlns:wp14="http://schemas.microsoft.com/office/word/2010/wordprocessingDrawing" xmlns:wp="http://schemas.openxmlformats.org/drawingml/2006/wordprocessingDrawing" xmlns:w10="urn:schemas-microsoft-com:office:word" xmlns:w="http://schemas.openxmlformats.org/wordprocessingml/2006/main" xmlns:w14="http://schemas.microsoft.com/office/word/2010/wordml" xmlns:w15="http://schemas.microsoft.com/office/word/2012/wordml" xmlns:w16cex="http://schemas.microsoft.com/office/word/2018/wordml/cex" xmlns:w16cid="http://schemas.microsoft.com/office/word/2016/wordml/cid" xmlns:w16="http://schemas.microsoft.com/office/word/2018/wordml" xmlns:w16sdtdh="http://schemas.microsoft.com/office/word/2020/wordml/sdtdatahash" xmlns:w16se="http://schemas.microsoft.com/office/word/2015/wordml/symex" xmlns:wpg="http://schemas.microsoft.com/office/word/2010/wordprocessingGroup" xmlns:wpi="http://schemas.microsoft.com/office/word/2010/wordprocessingInk" xmlns:wne="http://schemas.microsoft.com/office/word/2006/wordml" xmlns:wps="http://schemas.microsoft.com/office/word/2010/wordprocessingShape" mc:Ignorable="w14 w15 w16se w16cid w16 w16cex w16sdtdh wp14">
+<w:glossaryDocument xmlns:wpc="http://schemas.microsoft.com/office/word/2010/wordprocessingCanvas" xmlns:mc="http://schemas.openxmlformats.org/markup-compatibility/2006" xmlns:o="urn:schemas-microsoft-com:office:office" xmlns:r="http://schemas.openxmlformats.org/officeDocument/2006/relationships" xmlns:m="http://schemas.openxmlformats.org/officeDocument/2006/math" xmlns:v="urn:schemas-microsoft-com:vml" xmlns:wp14="http://schemas.microsoft.com/office/word/2010/wordprocessingDrawing" xmlns:wp="http://schemas.openxmlformats.org/drawingml/2006/wordprocessingDrawing" xmlns:w10="urn:schemas-microsoft-com:office:word" xmlns:w="http://schemas.openxmlformats.org/wordprocessingml/2006/main" xmlns:w14="http://schemas.microsoft.com/office/word/2010/wordml" xmlns:w15="http://schemas.microsoft.com/office/word/2012/wordml" xmlns:wpg="http://schemas.microsoft.com/office/word/2010/wordprocessingGroup" xmlns:wpi="http://schemas.microsoft.com/office/word/2010/wordprocessingInk" xmlns:wne="http://schemas.microsoft.com/office/word/2006/wordml" xmlns:wps="http://schemas.microsoft.com/office/word/2010/wordprocessingShape" mc:Ignorable="w14 w15 wp14">
   <w:docParts>
     <w:docPart>
       <w:docPartPr>
@@ -18708,13 +18806,13 @@
 </file>
 
 <file path=word/glossary/fontTable.xml><?xml version="1.0" encoding="utf-8"?>
-<w:fonts xmlns:mc="http://schemas.openxmlformats.org/markup-compatibility/2006" xmlns:r="http://schemas.openxmlformats.org/officeDocument/2006/relationships" xmlns:w="http://schemas.openxmlformats.org/wordprocessingml/2006/main" xmlns:w14="http://schemas.microsoft.com/office/word/2010/wordml" xmlns:w15="http://schemas.microsoft.com/office/word/2012/wordml" xmlns:w16cex="http://schemas.microsoft.com/office/word/2018/wordml/cex" xmlns:w16cid="http://schemas.microsoft.com/office/word/2016/wordml/cid" xmlns:w16="http://schemas.microsoft.com/office/word/2018/wordml" xmlns:w16sdtdh="http://schemas.microsoft.com/office/word/2020/wordml/sdtdatahash" xmlns:w16se="http://schemas.microsoft.com/office/word/2015/wordml/symex" mc:Ignorable="w14 w15 w16se w16cid w16 w16cex w16sdtdh">
+<w:fonts xmlns:mc="http://schemas.openxmlformats.org/markup-compatibility/2006" xmlns:r="http://schemas.openxmlformats.org/officeDocument/2006/relationships" xmlns:w="http://schemas.openxmlformats.org/wordprocessingml/2006/main" xmlns:w14="http://schemas.microsoft.com/office/word/2010/wordml" xmlns:w15="http://schemas.microsoft.com/office/word/2012/wordml" mc:Ignorable="w14 w15">
   <w:font w:name="Times New Roman">
     <w:panose1 w:val="02020603050405020304"/>
     <w:charset w:val="00"/>
     <w:family w:val="roman"/>
     <w:pitch w:val="variable"/>
-    <w:sig w:usb0="E0002EFF" w:usb1="C0007843" w:usb2="00000009" w:usb3="00000000" w:csb0="000001FF" w:csb1="00000000"/>
+    <w:sig w:usb0="E0002EFF" w:usb1="C000785B" w:usb2="00000009" w:usb3="00000000" w:csb0="000001FF" w:csb1="00000000"/>
   </w:font>
   <w:font w:name="Symbol">
     <w:panose1 w:val="05050102010706020507"/>
@@ -18728,7 +18826,7 @@
     <w:charset w:val="00"/>
     <w:family w:val="modern"/>
     <w:pitch w:val="fixed"/>
-    <w:sig w:usb0="E0002AFF" w:usb1="C0007843" w:usb2="00000009" w:usb3="00000000" w:csb0="000001FF" w:csb1="00000000"/>
+    <w:sig w:usb0="E0002EFF" w:usb1="C0007843" w:usb2="00000009" w:usb3="00000000" w:csb0="000001FF" w:csb1="00000000"/>
   </w:font>
   <w:font w:name="Wingdings">
     <w:panose1 w:val="05000000000000000000"/>
@@ -18742,10 +18840,10 @@
     <w:charset w:val="00"/>
     <w:family w:val="swiss"/>
     <w:pitch w:val="variable"/>
-    <w:sig w:usb0="E10002FF" w:usb1="4000ACFF" w:usb2="00000009" w:usb3="00000000" w:csb0="0000019F" w:csb1="00000000"/>
+    <w:sig w:usb0="E4002EFF" w:usb1="C000247B" w:usb2="00000009" w:usb3="00000000" w:csb0="000001FF" w:csb1="00000000"/>
   </w:font>
   <w:font w:name="Minion Pro">
-    <w:panose1 w:val="02040503050201020203"/>
+    <w:panose1 w:val="00000000000000000000"/>
     <w:charset w:val="00"/>
     <w:family w:val="roman"/>
     <w:notTrueType/>
@@ -18757,7 +18855,7 @@
     <w:charset w:val="00"/>
     <w:family w:val="roman"/>
     <w:pitch w:val="variable"/>
-    <w:sig w:usb0="E00002FF" w:usb1="400004FF" w:usb2="00000000" w:usb3="00000000" w:csb0="0000019F" w:csb1="00000000"/>
+    <w:sig w:usb0="E00006FF" w:usb1="420024FF" w:usb2="02000000" w:usb3="00000000" w:csb0="0000019F" w:csb1="00000000"/>
   </w:font>
   <w:font w:name="Tahoma">
     <w:panose1 w:val="020B0604030504040204"/>
@@ -18767,7 +18865,7 @@
     <w:sig w:usb0="E1002EFF" w:usb1="C000605B" w:usb2="00000029" w:usb3="00000000" w:csb0="000101FF" w:csb1="00000000"/>
   </w:font>
   <w:font w:name="Myriad Pro">
-    <w:panose1 w:val="020B0503030403020204"/>
+    <w:panose1 w:val="00000000000000000000"/>
     <w:charset w:val="00"/>
     <w:family w:val="swiss"/>
     <w:notTrueType/>
@@ -18779,20 +18877,20 @@
     <w:charset w:val="00"/>
     <w:family w:val="swiss"/>
     <w:pitch w:val="variable"/>
-    <w:sig w:usb0="E0002AFF" w:usb1="C0007843" w:usb2="00000009" w:usb3="00000000" w:csb0="000001FF" w:csb1="00000000"/>
+    <w:sig w:usb0="E0002EFF" w:usb1="C000785B" w:usb2="00000009" w:usb3="00000000" w:csb0="000001FF" w:csb1="00000000"/>
   </w:font>
   <w:font w:name="Calibri Light">
     <w:panose1 w:val="020F0302020204030204"/>
     <w:charset w:val="00"/>
     <w:family w:val="swiss"/>
     <w:pitch w:val="variable"/>
-    <w:sig w:usb0="A00002EF" w:usb1="4000207B" w:usb2="00000000" w:usb3="00000000" w:csb0="0000019F" w:csb1="00000000"/>
+    <w:sig w:usb0="E4002EFF" w:usb1="C000247B" w:usb2="00000009" w:usb3="00000000" w:csb0="000001FF" w:csb1="00000000"/>
   </w:font>
 </w:fonts>
 </file>
 
 <file path=word/glossary/settings.xml><?xml version="1.0" encoding="utf-8"?>
-<w:settings xmlns:mc="http://schemas.openxmlformats.org/markup-compatibility/2006" xmlns:o="urn:schemas-microsoft-com:office:office" xmlns:r="http://schemas.openxmlformats.org/officeDocument/2006/relationships" xmlns:m="http://schemas.openxmlformats.org/officeDocument/2006/math" xmlns:v="urn:schemas-microsoft-com:vml" xmlns:w10="urn:schemas-microsoft-com:office:word" xmlns:w="http://schemas.openxmlformats.org/wordprocessingml/2006/main" xmlns:w14="http://schemas.microsoft.com/office/word/2010/wordml" xmlns:w15="http://schemas.microsoft.com/office/word/2012/wordml" xmlns:w16cex="http://schemas.microsoft.com/office/word/2018/wordml/cex" xmlns:w16cid="http://schemas.microsoft.com/office/word/2016/wordml/cid" xmlns:w16="http://schemas.microsoft.com/office/word/2018/wordml" xmlns:w16sdtdh="http://schemas.microsoft.com/office/word/2020/wordml/sdtdatahash" xmlns:w16se="http://schemas.microsoft.com/office/word/2015/wordml/symex" xmlns:sl="http://schemas.openxmlformats.org/schemaLibrary/2006/main" mc:Ignorable="w14 w15 w16se w16cid w16 w16cex w16sdtdh">
+<w:settings xmlns:mc="http://schemas.openxmlformats.org/markup-compatibility/2006" xmlns:o="urn:schemas-microsoft-com:office:office" xmlns:r="http://schemas.openxmlformats.org/officeDocument/2006/relationships" xmlns:m="http://schemas.openxmlformats.org/officeDocument/2006/math" xmlns:v="urn:schemas-microsoft-com:vml" xmlns:w10="urn:schemas-microsoft-com:office:word" xmlns:w="http://schemas.openxmlformats.org/wordprocessingml/2006/main" xmlns:w14="http://schemas.microsoft.com/office/word/2010/wordml" xmlns:w15="http://schemas.microsoft.com/office/word/2012/wordml" xmlns:sl="http://schemas.openxmlformats.org/schemaLibrary/2006/main" mc:Ignorable="w14 w15">
   <w:view w:val="normal"/>
   <w:revisionView w:insDel="0" w:formatting="0"/>
   <w:defaultTabStop w:val="708"/>
@@ -18804,7 +18902,6 @@
     <w:compatSetting w:name="overrideTableStyleFontSizeAndJustification" w:uri="http://schemas.microsoft.com/office/word" w:val="1"/>
     <w:compatSetting w:name="enableOpenTypeFeatures" w:uri="http://schemas.microsoft.com/office/word" w:val="1"/>
     <w:compatSetting w:name="doNotFlipMirrorIndents" w:uri="http://schemas.microsoft.com/office/word" w:val="1"/>
-    <w:compatSetting w:name="useWord2013TrackBottomHyphenation" w:uri="http://schemas.microsoft.com/office/word" w:val="1"/>
   </w:compat>
   <w:rsids>
     <w:rsidRoot w:val="00FC5034"/>
@@ -18812,6 +18909,7 @@
     <w:rsid w:val="001D3E3A"/>
     <w:rsid w:val="00260B56"/>
     <w:rsid w:val="003650AA"/>
+    <w:rsid w:val="003B2C2B"/>
     <w:rsid w:val="005E56DC"/>
     <w:rsid w:val="005F195E"/>
     <w:rsid w:val="00694AAE"/>
@@ -18846,7 +18944,7 @@
 </file>
 
 <file path=word/glossary/styles.xml><?xml version="1.0" encoding="utf-8"?>
-<w:styles xmlns:mc="http://schemas.openxmlformats.org/markup-compatibility/2006" xmlns:r="http://schemas.openxmlformats.org/officeDocument/2006/relationships" xmlns:w="http://schemas.openxmlformats.org/wordprocessingml/2006/main" xmlns:w14="http://schemas.microsoft.com/office/word/2010/wordml" xmlns:w15="http://schemas.microsoft.com/office/word/2012/wordml" xmlns:w16cex="http://schemas.microsoft.com/office/word/2018/wordml/cex" xmlns:w16cid="http://schemas.microsoft.com/office/word/2016/wordml/cid" xmlns:w16="http://schemas.microsoft.com/office/word/2018/wordml" xmlns:w16sdtdh="http://schemas.microsoft.com/office/word/2020/wordml/sdtdatahash" xmlns:w16se="http://schemas.microsoft.com/office/word/2015/wordml/symex" mc:Ignorable="w14 w15 w16se w16cid w16 w16cex w16sdtdh">
+<w:styles xmlns:mc="http://schemas.openxmlformats.org/markup-compatibility/2006" xmlns:r="http://schemas.openxmlformats.org/officeDocument/2006/relationships" xmlns:w="http://schemas.openxmlformats.org/wordprocessingml/2006/main" xmlns:w14="http://schemas.microsoft.com/office/word/2010/wordml" xmlns:w15="http://schemas.microsoft.com/office/word/2012/wordml" mc:Ignorable="w14 w15">
   <w:docDefaults>
     <w:rPrDefault>
       <w:rPr>
@@ -18862,7 +18960,7 @@
       </w:pPr>
     </w:pPrDefault>
   </w:docDefaults>
-  <w:latentStyles w:defLockedState="0" w:defUIPriority="99" w:defSemiHidden="0" w:defUnhideWhenUsed="0" w:defQFormat="0" w:count="376">
+  <w:latentStyles w:defLockedState="0" w:defUIPriority="99" w:defSemiHidden="0" w:defUnhideWhenUsed="0" w:defQFormat="0" w:count="371">
     <w:lsdException w:name="Normal" w:uiPriority="0" w:qFormat="1"/>
     <w:lsdException w:name="heading 1" w:uiPriority="9" w:qFormat="1"/>
     <w:lsdException w:name="heading 2" w:semiHidden="1" w:uiPriority="9" w:unhideWhenUsed="1" w:qFormat="1"/>
@@ -19234,11 +19332,6 @@
     <w:lsdException w:name="List Table 5 Dark Accent 6" w:uiPriority="50"/>
     <w:lsdException w:name="List Table 6 Colorful Accent 6" w:uiPriority="51"/>
     <w:lsdException w:name="List Table 7 Colorful Accent 6" w:uiPriority="52"/>
-    <w:lsdException w:name="Mention" w:semiHidden="1" w:unhideWhenUsed="1"/>
-    <w:lsdException w:name="Smart Hyperlink" w:semiHidden="1" w:unhideWhenUsed="1"/>
-    <w:lsdException w:name="Hashtag" w:semiHidden="1" w:unhideWhenUsed="1"/>
-    <w:lsdException w:name="Unresolved Mention" w:semiHidden="1" w:unhideWhenUsed="1"/>
-    <w:lsdException w:name="Smart Link" w:semiHidden="1" w:unhideWhenUsed="1"/>
   </w:latentStyles>
   <w:style w:type="paragraph" w:default="1" w:styleId="Standard">
     <w:name w:val="Normal"/>
@@ -19291,7 +19384,7 @@
 </file>
 
 <file path=word/glossary/webSettings.xml><?xml version="1.0" encoding="utf-8"?>
-<w:webSettings xmlns:mc="http://schemas.openxmlformats.org/markup-compatibility/2006" xmlns:r="http://schemas.openxmlformats.org/officeDocument/2006/relationships" xmlns:w="http://schemas.openxmlformats.org/wordprocessingml/2006/main" xmlns:w14="http://schemas.microsoft.com/office/word/2010/wordml" xmlns:w15="http://schemas.microsoft.com/office/word/2012/wordml" xmlns:w16cex="http://schemas.microsoft.com/office/word/2018/wordml/cex" xmlns:w16cid="http://schemas.microsoft.com/office/word/2016/wordml/cid" xmlns:w16="http://schemas.microsoft.com/office/word/2018/wordml" xmlns:w16sdtdh="http://schemas.microsoft.com/office/word/2020/wordml/sdtdatahash" xmlns:w16se="http://schemas.microsoft.com/office/word/2015/wordml/symex" mc:Ignorable="w14 w15 w16se w16cid w16 w16cex w16sdtdh">
+<w:webSettings xmlns:mc="http://schemas.openxmlformats.org/markup-compatibility/2006" xmlns:r="http://schemas.openxmlformats.org/officeDocument/2006/relationships" xmlns:w="http://schemas.openxmlformats.org/wordprocessingml/2006/main" xmlns:w14="http://schemas.microsoft.com/office/word/2010/wordml" xmlns:w15="http://schemas.microsoft.com/office/word/2012/wordml" mc:Ignorable="w14 w15">
   <w:optimizeForBrowser/>
   <w:allowPNG/>
 </w:webSettings>
@@ -19606,7 +19699,7 @@
 </file>
 
 <file path=customXml/itemProps2.xml><?xml version="1.0" encoding="utf-8"?>
-<ds:datastoreItem xmlns:ds="http://schemas.openxmlformats.org/officeDocument/2006/customXml" ds:itemID="{E9272329-9BE3-4E86-B757-5E1E01D59131}">
+<ds:datastoreItem xmlns:ds="http://schemas.openxmlformats.org/officeDocument/2006/customXml" ds:itemID="{682B0383-A3CA-4A68-9BB4-7F525D262761}">
   <ds:schemaRefs>
     <ds:schemaRef ds:uri="http://schemas.openxmlformats.org/officeDocument/2006/bibliography"/>
   </ds:schemaRefs>

</xml_diff>